<commit_message>
Rewrite Understanding doc in plainer human tone (remove em-dash style)
- Rewrite all prose in a direct first-person voice
- Remove em-dashes and en-dashes; restructure sentences accordingly
- Keep structure, tables, city footprint and deliverables intact

Co-Authored-By: Claude Opus 4.8 <noreply@anthropic.com>
Claude-Session: https://claude.ai/code/session_01SPjFYHW1nTDVr5tUuToRXR
</commit_message>
<xml_diff>
--- a/doft_diwali_popup/Doft_Understanding_and_Key_Deliverables.docx
+++ b/doft_diwali_popup/Doft_Understanding_and_Key_Deliverables.docx
@@ -69,7 +69,7 @@
           <w:sz w:val="21"/>
           <w:szCs w:val="21"/>
         </w:rPr>
-        <w:t xml:space="preserve">      |      Diwali Seasons 2026 · 2027 · 2028</w:t>
+        <w:t xml:space="preserve">      |      Diwali Seasons 2026, 2027 and 2028</w:t>
       </w:r>
     </w:p>
     <w:p>
@@ -88,7 +88,7 @@
           <w:sz w:val="18"/>
           <w:szCs w:val="18"/>
         </w:rPr>
-        <w:t xml:space="preserve">Date: 30 July 2026      ·      Status: For Doft review</w:t>
+        <w:t xml:space="preserve">Date: 30 July 2026      |      For your review</w:t>
       </w:r>
     </w:p>
     <w:p>
@@ -107,7 +107,7 @@
           <w:sz w:val="27"/>
           <w:szCs w:val="27"/>
         </w:rPr>
-        <w:t xml:space="preserve">1.  Document Purpose</w:t>
+        <w:t xml:space="preserve">1.  Purpose of this Note</w:t>
       </w:r>
     </w:p>
     <w:p>
@@ -121,67 +121,7 @@
           <w:sz w:val="21"/>
           <w:szCs w:val="21"/>
         </w:rPr>
-        <w:t xml:space="preserve">This document sets out ProMarcom's understanding of Doft Candles' requirement for the Diwali pop-up retail programme, and the key deliverables ProMarcom will own as the appointed operations partner. It reflects the parameters agreed with the Doft team — a compact </w:t>
-      </w:r>
-      <w:r>
-        <w:rPr>
-          <w:rFonts w:ascii="Calibri" w:cs="Calibri" w:eastAsia="Calibri" w:hAnsi="Calibri"/>
-          <w:b/>
-          <w:bCs/>
-          <w:color w:val="2E2A28"/>
-          <w:sz w:val="21"/>
-          <w:szCs w:val="21"/>
-        </w:rPr>
-        <w:t xml:space="preserve">8 ft × 8 ft premium kiosk</w:t>
-      </w:r>
-      <w:r>
-        <w:rPr>
-          <w:rFonts w:ascii="Calibri" w:cs="Calibri" w:eastAsia="Calibri" w:hAnsi="Calibri"/>
-          <w:color w:val="2E2A28"/>
-          <w:sz w:val="21"/>
-          <w:szCs w:val="21"/>
-        </w:rPr>
-        <w:t xml:space="preserve">, a </w:t>
-      </w:r>
-      <w:r>
-        <w:rPr>
-          <w:rFonts w:ascii="Calibri" w:cs="Calibri" w:eastAsia="Calibri" w:hAnsi="Calibri"/>
-          <w:b/>
-          <w:bCs/>
-          <w:color w:val="2E2A28"/>
-          <w:sz w:val="21"/>
-          <w:szCs w:val="21"/>
-        </w:rPr>
-        <w:t xml:space="preserve">six-week operating window</w:t>
-      </w:r>
-      <w:r>
-        <w:rPr>
-          <w:rFonts w:ascii="Calibri" w:cs="Calibri" w:eastAsia="Calibri" w:hAnsi="Calibri"/>
-          <w:color w:val="2E2A28"/>
-          <w:sz w:val="21"/>
-          <w:szCs w:val="21"/>
-        </w:rPr>
-        <w:t xml:space="preserve">, and a roll-out across </w:t>
-      </w:r>
-      <w:r>
-        <w:rPr>
-          <w:rFonts w:ascii="Calibri" w:cs="Calibri" w:eastAsia="Calibri" w:hAnsi="Calibri"/>
-          <w:b/>
-          <w:bCs/>
-          <w:color w:val="2E2A28"/>
-          <w:sz w:val="21"/>
-          <w:szCs w:val="21"/>
-        </w:rPr>
-        <w:t xml:space="preserve">metro and sub-metro cities</w:t>
-      </w:r>
-      <w:r>
-        <w:rPr>
-          <w:rFonts w:ascii="Calibri" w:cs="Calibri" w:eastAsia="Calibri" w:hAnsi="Calibri"/>
-          <w:color w:val="2E2A28"/>
-          <w:sz w:val="21"/>
-          <w:szCs w:val="21"/>
-        </w:rPr>
-        <w:t xml:space="preserve"> — and includes ProMarcom's recommended city footprint. Detailed commercials are covered under a separate proposal.</w:t>
+        <w:t xml:space="preserve">This note sets out how we understand the Diwali pop-up requirement and what we will deliver as your operations partner. It is based on the parameters we agreed with your team: a compact 8x8 ft kiosk, a six-week run, and a presence across the metros and sub-metros. It also carries our suggested city list. Commercials are covered in a separate proposal.</w:t>
       </w:r>
     </w:p>
     <w:p>
@@ -200,7 +140,7 @@
           <w:sz w:val="27"/>
           <w:szCs w:val="27"/>
         </w:rPr>
-        <w:t xml:space="preserve">2.  Our Understanding of the Requirement</w:t>
+        <w:t xml:space="preserve">2.  How We Understand the Requirement</w:t>
       </w:r>
     </w:p>
     <w:p>
@@ -214,47 +154,7 @@
           <w:sz w:val="21"/>
           <w:szCs w:val="21"/>
         </w:rPr>
-        <w:t xml:space="preserve">Doft Candles operates premium home-fragrance pop-up kiosks in leading malls during the Diwali season. For the 2026 season — with the intent to continue the partnership in 2027 and 2028 — Doft will deploy compact </w:t>
-      </w:r>
-      <w:r>
-        <w:rPr>
-          <w:rFonts w:ascii="Calibri" w:cs="Calibri" w:eastAsia="Calibri" w:hAnsi="Calibri"/>
-          <w:b/>
-          <w:bCs/>
-          <w:color w:val="2E2A28"/>
-          <w:sz w:val="21"/>
-          <w:szCs w:val="21"/>
-        </w:rPr>
-        <w:t xml:space="preserve">8 ft × 8 ft</w:t>
-      </w:r>
-      <w:r>
-        <w:rPr>
-          <w:rFonts w:ascii="Calibri" w:cs="Calibri" w:eastAsia="Calibri" w:hAnsi="Calibri"/>
-          <w:color w:val="2E2A28"/>
-          <w:sz w:val="21"/>
-          <w:szCs w:val="21"/>
-        </w:rPr>
-        <w:t xml:space="preserve"> kiosks in high-footfall malls across metro and sub-metro cities, operating for </w:t>
-      </w:r>
-      <w:r>
-        <w:rPr>
-          <w:rFonts w:ascii="Calibri" w:cs="Calibri" w:eastAsia="Calibri" w:hAnsi="Calibri"/>
-          <w:b/>
-          <w:bCs/>
-          <w:color w:val="2E2A28"/>
-          <w:sz w:val="21"/>
-          <w:szCs w:val="21"/>
-        </w:rPr>
-        <w:t xml:space="preserve">six weeks</w:t>
-      </w:r>
-      <w:r>
-        <w:rPr>
-          <w:rFonts w:ascii="Calibri" w:cs="Calibri" w:eastAsia="Calibri" w:hAnsi="Calibri"/>
-          <w:color w:val="2E2A28"/>
-          <w:sz w:val="21"/>
-          <w:szCs w:val="21"/>
-        </w:rPr>
-        <w:t xml:space="preserve"> in the run-up to and through Diwali. ProMarcom will recruit, deploy and manage all on-ground operations end to end, while Doft supplies the saleable stock, kiosk design, POS/EDC machines and uniforms.</w:t>
+        <w:t xml:space="preserve">Doft runs premium home-fragrance kiosks in leading malls through the Diwali season. For 2026, and with the plan to carry on in 2027 and 2028, you will run compact 8x8 ft kiosks in busy malls across the metros and sub-metros, trading for six weeks around Diwali. We handle everything on the ground, from hiring and deployment to the day-to-day running. You supply the stock, the kiosk design, the POS/EDC machines and the uniforms.</w:t>
       </w:r>
     </w:p>
     <w:p>
@@ -270,7 +170,7 @@
           <w:sz w:val="23"/>
           <w:szCs w:val="23"/>
         </w:rPr>
-        <w:t xml:space="preserve">Engagement at a glance</w:t>
+        <w:t xml:space="preserve">Quick summary</w:t>
       </w:r>
     </w:p>
     <w:tbl>
@@ -312,7 +212,7 @@
                 <w:sz w:val="19"/>
                 <w:szCs w:val="19"/>
               </w:rPr>
-              <w:t xml:space="preserve">Parameter</w:t>
+              <w:t xml:space="preserve">Item</w:t>
             </w:r>
           </w:p>
         </w:tc>
@@ -369,7 +269,7 @@
                 <w:sz w:val="19"/>
                 <w:szCs w:val="19"/>
               </w:rPr>
-              <w:t xml:space="preserve">Engagement term</w:t>
+              <w:t xml:space="preserve">Term</w:t>
             </w:r>
           </w:p>
         </w:tc>
@@ -398,7 +298,7 @@
                 <w:sz w:val="19"/>
                 <w:szCs w:val="19"/>
               </w:rPr>
-              <w:t xml:space="preserve">Diwali seasons 2026, 2027 &amp; 2028 (renewed annually)</w:t>
+              <w:t xml:space="preserve">Diwali seasons 2026, 2027 and 2028, renewed each year</w:t>
             </w:r>
           </w:p>
         </w:tc>
@@ -458,7 +358,7 @@
                 <w:sz w:val="19"/>
                 <w:szCs w:val="19"/>
               </w:rPr>
-              <w:t xml:space="preserve">6 weeks of live operations per city, across the Diwali season</w:t>
+              <w:t xml:space="preserve">Six weeks of live trading per city, across the Diwali season</w:t>
             </w:r>
           </w:p>
         </w:tc>
@@ -489,7 +389,7 @@
                 <w:sz w:val="19"/>
                 <w:szCs w:val="19"/>
               </w:rPr>
-              <w:t xml:space="preserve">Kiosk footprint</w:t>
+              <w:t xml:space="preserve">Kiosk size</w:t>
             </w:r>
           </w:p>
         </w:tc>
@@ -518,7 +418,7 @@
                 <w:sz w:val="19"/>
                 <w:szCs w:val="19"/>
               </w:rPr>
-              <w:t xml:space="preserve">8 ft × 8 ft (≈ 64 sq ft) — compact premium kiosk to Doft-approved design</w:t>
+              <w:t xml:space="preserve">8x8 ft (about 64 sq ft), built to your approved design</w:t>
             </w:r>
           </w:p>
         </w:tc>
@@ -549,7 +449,7 @@
                 <w:sz w:val="19"/>
                 <w:szCs w:val="19"/>
               </w:rPr>
-              <w:t xml:space="preserve">Back-store / storage</w:t>
+              <w:t xml:space="preserve">Backup storage</w:t>
             </w:r>
           </w:p>
         </w:tc>
@@ -578,7 +478,7 @@
                 <w:sz w:val="19"/>
                 <w:szCs w:val="19"/>
               </w:rPr>
-              <w:t xml:space="preserve">≈ 40 sq ft secure replenishment storage (or mall-provided), per kiosk cluster</w:t>
+              <w:t xml:space="preserve">About 40 sq ft of secure storage for replenishment, or mall-provided</w:t>
             </w:r>
           </w:p>
         </w:tc>
@@ -609,7 +509,7 @@
                 <w:sz w:val="19"/>
                 <w:szCs w:val="19"/>
               </w:rPr>
-              <w:t xml:space="preserve">City footprint</w:t>
+              <w:t xml:space="preserve">Cities</w:t>
             </w:r>
           </w:p>
         </w:tc>
@@ -638,7 +538,7 @@
                 <w:sz w:val="19"/>
                 <w:szCs w:val="19"/>
               </w:rPr>
-              <w:t xml:space="preserve">Metro + sub-metro cities (see Section 3 — Recommended City Footprint)</w:t>
+              <w:t xml:space="preserve">Metros and sub-metros (our suggestions are in Section 3)</w:t>
             </w:r>
           </w:p>
         </w:tc>
@@ -669,7 +569,7 @@
                 <w:sz w:val="19"/>
                 <w:szCs w:val="19"/>
               </w:rPr>
-              <w:t xml:space="preserve">Pop-ups per city</w:t>
+              <w:t xml:space="preserve">Kiosks per city</w:t>
             </w:r>
           </w:p>
         </w:tc>
@@ -698,7 +598,7 @@
                 <w:sz w:val="19"/>
                 <w:szCs w:val="19"/>
               </w:rPr>
-              <w:t xml:space="preserve">1–3 kiosks, subject to mall availability, footfall and Doft approval</w:t>
+              <w:t xml:space="preserve">1 to 3, based on mall availability, footfall and your sign-off</w:t>
             </w:r>
           </w:p>
         </w:tc>
@@ -729,7 +629,7 @@
                 <w:sz w:val="19"/>
                 <w:szCs w:val="19"/>
               </w:rPr>
-              <w:t xml:space="preserve">Staffing</w:t>
+              <w:t xml:space="preserve">Team</w:t>
             </w:r>
           </w:p>
         </w:tc>
@@ -758,7 +658,7 @@
                 <w:sz w:val="19"/>
                 <w:szCs w:val="19"/>
               </w:rPr>
-              <w:t xml:space="preserve">Right-sized compact-kiosk team on a two-shift roster (see Section 5)</w:t>
+              <w:t xml:space="preserve">A compact kiosk team on two shifts (see Section 5)</w:t>
             </w:r>
           </w:p>
         </w:tc>
@@ -818,7 +718,7 @@
                 <w:sz w:val="19"/>
                 <w:szCs w:val="19"/>
               </w:rPr>
-              <w:t xml:space="preserve">Doft-led 1-day product &amp; sales training, 10–21 days pre-launch, 100% attendance</w:t>
+              <w:t xml:space="preserve">One-day product and sales training by Doft, 10 to 21 days before launch, full attendance</w:t>
             </w:r>
           </w:p>
         </w:tc>
@@ -849,7 +749,7 @@
                 <w:sz w:val="19"/>
                 <w:szCs w:val="19"/>
               </w:rPr>
-              <w:t xml:space="preserve">Supplied by Doft</w:t>
+              <w:t xml:space="preserve">You supply</w:t>
             </w:r>
           </w:p>
         </w:tc>
@@ -878,7 +778,7 @@
                 <w:sz w:val="19"/>
                 <w:szCs w:val="19"/>
               </w:rPr>
-              <w:t xml:space="preserve">Saleable stock · kiosk design/kit · pop-up furniture · POS/EDC · uniforms (returnable)</w:t>
+              <w:t xml:space="preserve">Stock, kiosk design and kit, furniture, POS/EDC, uniforms (returnable)</w:t>
             </w:r>
           </w:p>
         </w:tc>
@@ -909,7 +809,7 @@
                 <w:sz w:val="19"/>
                 <w:szCs w:val="19"/>
               </w:rPr>
-              <w:t xml:space="preserve">Owned by ProMarcom</w:t>
+              <w:t xml:space="preserve">We handle</w:t>
             </w:r>
           </w:p>
         </w:tc>
@@ -938,7 +838,7 @@
                 <w:sz w:val="19"/>
                 <w:szCs w:val="19"/>
               </w:rPr>
-              <w:t xml:space="preserve">Kiosk fabrication &amp; install · manpower · logistics · licences · daily operations · reporting</w:t>
+              <w:t xml:space="preserve">Kiosk build and install, manpower, logistics, licences, daily operations and reporting</w:t>
             </w:r>
           </w:p>
         </w:tc>
@@ -960,7 +860,7 @@
           <w:sz w:val="27"/>
           <w:szCs w:val="27"/>
         </w:rPr>
-        <w:t xml:space="preserve">3.  Recommended City Footprint</w:t>
+        <w:t xml:space="preserve">3.  Suggested City Footprint</w:t>
       </w:r>
     </w:p>
     <w:p>
@@ -974,47 +874,7 @@
           <w:sz w:val="21"/>
           <w:szCs w:val="21"/>
         </w:rPr>
-        <w:t xml:space="preserve">We recommend anchoring the launch in India's </w:t>
-      </w:r>
-      <w:r>
-        <w:rPr>
-          <w:rFonts w:ascii="Calibri" w:cs="Calibri" w:eastAsia="Calibri" w:hAnsi="Calibri"/>
-          <w:b/>
-          <w:bCs/>
-          <w:color w:val="2E2A28"/>
-          <w:sz w:val="21"/>
-          <w:szCs w:val="21"/>
-        </w:rPr>
-        <w:t xml:space="preserve">metro cities</w:t>
-      </w:r>
-      <w:r>
-        <w:rPr>
-          <w:rFonts w:ascii="Calibri" w:cs="Calibri" w:eastAsia="Calibri" w:hAnsi="Calibri"/>
-          <w:color w:val="2E2A28"/>
-          <w:sz w:val="21"/>
-          <w:szCs w:val="21"/>
-        </w:rPr>
-        <w:t xml:space="preserve"> — where premium mall footfall and gifting spend peak during Diwali — and extending into high-potential </w:t>
-      </w:r>
-      <w:r>
-        <w:rPr>
-          <w:rFonts w:ascii="Calibri" w:cs="Calibri" w:eastAsia="Calibri" w:hAnsi="Calibri"/>
-          <w:b/>
-          <w:bCs/>
-          <w:color w:val="2E2A28"/>
-          <w:sz w:val="21"/>
-          <w:szCs w:val="21"/>
-        </w:rPr>
-        <w:t xml:space="preserve">sub-metro cities</w:t>
-      </w:r>
-      <w:r>
-        <w:rPr>
-          <w:rFonts w:ascii="Calibri" w:cs="Calibri" w:eastAsia="Calibri" w:hAnsi="Calibri"/>
-          <w:color w:val="2E2A28"/>
-          <w:sz w:val="21"/>
-          <w:szCs w:val="21"/>
-        </w:rPr>
-        <w:t xml:space="preserve"> that have matured into strong premium-retail markets. A phased approach lets Doft establish the format in the metros first, then scale into sub-metros within the same season or in 2027–28.</w:t>
+        <w:t xml:space="preserve">We suggest starting in the metros, where premium mall footfall and festive spending are highest, and then adding the stronger sub-metros. Running it in two phases lets you settle the format in the metros first and widen the reach afterwards, either later in the same season or in the following years.</w:t>
       </w:r>
     </w:p>
     <w:p>
@@ -1030,7 +890,7 @@
           <w:sz w:val="23"/>
           <w:szCs w:val="23"/>
         </w:rPr>
-        <w:t xml:space="preserve">Phase 1 — Metro cities (priority launch)</w:t>
+        <w:t xml:space="preserve">Phase 1: Metro cities (launch first)</w:t>
       </w:r>
     </w:p>
     <w:tbl>
@@ -1214,7 +1074,7 @@
                 <w:sz w:val="19"/>
                 <w:szCs w:val="19"/>
               </w:rPr>
-              <w:t xml:space="preserve">Largest premium &amp; gifting market</w:t>
+              <w:t xml:space="preserve">Largest premium and gifting market</w:t>
             </w:r>
           </w:p>
         </w:tc>
@@ -1303,7 +1163,7 @@
                 <w:sz w:val="19"/>
                 <w:szCs w:val="19"/>
               </w:rPr>
-              <w:t xml:space="preserve">High disposable income; luxury footfall</w:t>
+              <w:t xml:space="preserve">High spend, strong luxury footfall</w:t>
             </w:r>
           </w:p>
         </w:tc>
@@ -1392,7 +1252,7 @@
                 <w:sz w:val="19"/>
                 <w:szCs w:val="19"/>
               </w:rPr>
-              <w:t xml:space="preserve">Young affluent, strong home-décor demand</w:t>
+              <w:t xml:space="preserve">Young, affluent, big on home décor</w:t>
             </w:r>
           </w:p>
         </w:tc>
@@ -1570,7 +1430,7 @@
                 <w:sz w:val="19"/>
                 <w:szCs w:val="19"/>
               </w:rPr>
-              <w:t xml:space="preserve">Established gifting culture</w:t>
+              <w:t xml:space="preserve">Steady gifting culture</w:t>
             </w:r>
           </w:p>
         </w:tc>
@@ -1659,7 +1519,7 @@
                 <w:sz w:val="19"/>
                 <w:szCs w:val="19"/>
               </w:rPr>
-              <w:t xml:space="preserve">Diwali/festive gifting stronghold</w:t>
+              <w:t xml:space="preserve">Strong festive gifting market</w:t>
             </w:r>
           </w:p>
         </w:tc>
@@ -1767,7 +1627,7 @@
           <w:sz w:val="23"/>
           <w:szCs w:val="23"/>
         </w:rPr>
-        <w:t xml:space="preserve">Phase 2 — Sub-metro cities (high-potential expansion)</w:t>
+        <w:t xml:space="preserve">Phase 2: Sub-metro cities (next wave)</w:t>
       </w:r>
     </w:p>
     <w:tbl>
@@ -1951,7 +1811,7 @@
                 <w:sz w:val="19"/>
                 <w:szCs w:val="19"/>
               </w:rPr>
-              <w:t xml:space="preserve">Large affluent, gifting-led market</w:t>
+              <w:t xml:space="preserve">Large, affluent, gifting-led</w:t>
             </w:r>
           </w:p>
         </w:tc>
@@ -2040,7 +1900,7 @@
                 <w:sz w:val="19"/>
                 <w:szCs w:val="19"/>
               </w:rPr>
-              <w:t xml:space="preserve">Premium &amp; wedding/festive spend</w:t>
+              <w:t xml:space="preserve">Premium and wedding season spend</w:t>
             </w:r>
           </w:p>
         </w:tc>
@@ -2129,7 +1989,7 @@
                 <w:sz w:val="19"/>
                 <w:szCs w:val="19"/>
               </w:rPr>
-              <w:t xml:space="preserve">High per-capita premium retail</w:t>
+              <w:t xml:space="preserve">High per-head premium retail</w:t>
             </w:r>
           </w:p>
         </w:tc>
@@ -2218,7 +2078,7 @@
                 <w:sz w:val="19"/>
                 <w:szCs w:val="19"/>
               </w:rPr>
-              <w:t xml:space="preserve">Emerging luxury mall footfall</w:t>
+              <w:t xml:space="preserve">Rising luxury mall footfall</w:t>
             </w:r>
           </w:p>
         </w:tc>
@@ -2396,7 +2256,7 @@
                 <w:sz w:val="19"/>
                 <w:szCs w:val="19"/>
               </w:rPr>
-              <w:t xml:space="preserve">Growing premium consumption</w:t>
+              <w:t xml:space="preserve">Growing premium spend</w:t>
             </w:r>
           </w:p>
         </w:tc>
@@ -2485,7 +2345,7 @@
                 <w:sz w:val="19"/>
                 <w:szCs w:val="19"/>
               </w:rPr>
-              <w:t xml:space="preserve">High-income, gifting-oriented</w:t>
+              <w:t xml:space="preserve">High income, gifting-oriented</w:t>
             </w:r>
           </w:p>
         </w:tc>
@@ -2504,7 +2364,7 @@
           <w:sz w:val="19"/>
           <w:szCs w:val="19"/>
         </w:rPr>
-        <w:t xml:space="preserve">Mall names are indicative; final selection will be confirmed against live availability, footfall data, category fit and licence economics. We recommend confirming the metro list first to lock premium mall slots early, as Diwali inventory books out quickly.</w:t>
+        <w:t xml:space="preserve">These mall names are only indicative. We will confirm the final list against live availability, footfall, category fit and licence cost. Our advice is to lock the metros first, since premium Diwali slots fill up early.</w:t>
       </w:r>
     </w:p>
     <w:p>
@@ -2523,7 +2383,7 @@
           <w:sz w:val="27"/>
           <w:szCs w:val="27"/>
         </w:rPr>
-        <w:t xml:space="preserve">4.  Key Deliverables (ProMarcom Scope)</w:t>
+        <w:t xml:space="preserve">4.  What We Will Deliver</w:t>
       </w:r>
     </w:p>
     <w:p>
@@ -2537,7 +2397,7 @@
           <w:sz w:val="21"/>
           <w:szCs w:val="21"/>
         </w:rPr>
-        <w:t xml:space="preserve">ProMarcom will own the following workstreams end to end. Each is delivered to Doft's brand standards and mall compliance requirements.</w:t>
+        <w:t xml:space="preserve">We will run the workstreams below, each to your brand standards and the mall's compliance rules.</w:t>
       </w:r>
     </w:p>
     <w:tbl>
@@ -2605,7 +2465,7 @@
                 <w:sz w:val="19"/>
                 <w:szCs w:val="19"/>
               </w:rPr>
-              <w:t xml:space="preserve">Key deliverables &amp; outputs</w:t>
+              <w:t xml:space="preserve">What we deliver</w:t>
             </w:r>
           </w:p>
         </w:tc>
@@ -2636,7 +2496,7 @@
                 <w:sz w:val="19"/>
                 <w:szCs w:val="19"/>
               </w:rPr>
-              <w:t xml:space="preserve">1. Kiosk fabrication &amp; installation</w:t>
+              <w:t xml:space="preserve">1. Kiosk build &amp; install</w:t>
             </w:r>
           </w:p>
         </w:tc>
@@ -2668,7 +2528,7 @@
                 <w:sz w:val="18"/>
                 <w:szCs w:val="18"/>
               </w:rPr>
-              <w:t xml:space="preserve">On-site fabrication &amp; installation of the 8×8 kiosk to Doft-approved design</w:t>
+              <w:t xml:space="preserve">Build and install the 8x8 kiosk to your approved design</w:t>
             </w:r>
           </w:p>
           <w:p>
@@ -2687,7 +2547,7 @@
                 <w:sz w:val="18"/>
                 <w:szCs w:val="18"/>
               </w:rPr>
-              <w:t xml:space="preserve">Transport, setup, maintenance, dismantling &amp; return of fixtures</w:t>
+              <w:t xml:space="preserve">Transport, setup, upkeep, dismantling and return of fixtures</w:t>
             </w:r>
           </w:p>
           <w:p>
@@ -2706,7 +2566,7 @@
                 <w:sz w:val="18"/>
                 <w:szCs w:val="18"/>
               </w:rPr>
-              <w:t xml:space="preserve">3-day buffer before go-live to absorb any fabrication delay</w:t>
+              <w:t xml:space="preserve">A 3-day buffer before go-live to cover any build delay</w:t>
             </w:r>
           </w:p>
         </w:tc>
@@ -2769,7 +2629,7 @@
                 <w:sz w:val="18"/>
                 <w:szCs w:val="18"/>
               </w:rPr>
-              <w:t xml:space="preserve">Liaison with mall management across the engagement</w:t>
+              <w:t xml:space="preserve">Liaison with mall management through the season</w:t>
             </w:r>
           </w:p>
           <w:p>
@@ -2788,7 +2648,7 @@
                 <w:sz w:val="18"/>
                 <w:szCs w:val="18"/>
               </w:rPr>
-              <w:t xml:space="preserve">All permissions, licences, documentation &amp; compliance</w:t>
+              <w:t xml:space="preserve">All permissions, licences, documents and compliance</w:t>
             </w:r>
           </w:p>
           <w:p>
@@ -2807,7 +2667,7 @@
                 <w:sz w:val="18"/>
                 <w:szCs w:val="18"/>
               </w:rPr>
-              <w:t xml:space="preserve">Electricity, access passes, loading/unloading &amp; operational approvals</w:t>
+              <w:t xml:space="preserve">Electricity, access passes, loading/unloading and operational approvals</w:t>
             </w:r>
           </w:p>
         </w:tc>
@@ -2838,7 +2698,7 @@
                 <w:sz w:val="19"/>
                 <w:szCs w:val="19"/>
               </w:rPr>
-              <w:t xml:space="preserve">3. Logistics &amp; stock replenishment</w:t>
+              <w:t xml:space="preserve">3. Logistics &amp; replenishment</w:t>
             </w:r>
           </w:p>
         </w:tc>
@@ -2870,7 +2730,7 @@
                 <w:sz w:val="18"/>
                 <w:szCs w:val="18"/>
               </w:rPr>
-              <w:t xml:space="preserve">Collection &amp; transport of stock from Doft's Ghaziabad warehouse</w:t>
+              <w:t xml:space="preserve">Pick up and move stock from your Ghaziabad warehouse</w:t>
             </w:r>
           </w:p>
           <w:p>
@@ -2889,7 +2749,7 @@
                 <w:sz w:val="18"/>
                 <w:szCs w:val="18"/>
               </w:rPr>
-              <w:t xml:space="preserve">Timely replenishment via local secure storage; reorder-level triggers</w:t>
+              <w:t xml:space="preserve">Refill on time from local storage, with reorder levels set per SKU</w:t>
             </w:r>
           </w:p>
           <w:p>
@@ -2908,7 +2768,7 @@
                 <w:sz w:val="18"/>
                 <w:szCs w:val="18"/>
               </w:rPr>
-              <w:t xml:space="preserve">Safe handling, inventory control &amp; return of unsold stock with reconciliation</w:t>
+              <w:t xml:space="preserve">Safe handling, stock control, and return of unsold stock with reconciliation</w:t>
             </w:r>
           </w:p>
         </w:tc>
@@ -2971,7 +2831,7 @@
                 <w:sz w:val="18"/>
                 <w:szCs w:val="18"/>
               </w:rPr>
-              <w:t xml:space="preserve">Sourcing, background verification, deployment &amp; attendance management</w:t>
+              <w:t xml:space="preserve">Sourcing, background checks, deployment and attendance</w:t>
             </w:r>
           </w:p>
           <w:p>
@@ -2990,7 +2850,7 @@
                 <w:sz w:val="18"/>
                 <w:szCs w:val="18"/>
               </w:rPr>
-              <w:t xml:space="preserve">Payroll and full statutory compliance for all deployed staff</w:t>
+              <w:t xml:space="preserve">Payroll and full statutory compliance for all staff</w:t>
             </w:r>
           </w:p>
           <w:p>
@@ -3009,7 +2869,7 @@
                 <w:sz w:val="18"/>
                 <w:szCs w:val="18"/>
               </w:rPr>
-              <w:t xml:space="preserve">Immediate, no-cost replacement of any absent or resigned staff</w:t>
+              <w:t xml:space="preserve">Same-day replacement of any absent or resigned staff, at no extra cost</w:t>
             </w:r>
           </w:p>
         </w:tc>
@@ -3072,7 +2932,7 @@
                 <w:sz w:val="18"/>
                 <w:szCs w:val="18"/>
               </w:rPr>
-              <w:t xml:space="preserve">Coordinate 100% attendance at Doft's 1-day product &amp; sales training</w:t>
+              <w:t xml:space="preserve">Get full attendance at your one-day product and sales training</w:t>
             </w:r>
           </w:p>
           <w:p>
@@ -3091,7 +2951,7 @@
                 <w:sz w:val="18"/>
                 <w:szCs w:val="18"/>
               </w:rPr>
-              <w:t xml:space="preserve">Keep trained staff available throughout; arrange replacement training</w:t>
+              <w:t xml:space="preserve">Keep trained staff on through the season, and train any replacements</w:t>
             </w:r>
           </w:p>
         </w:tc>
@@ -3154,7 +3014,7 @@
                 <w:sz w:val="18"/>
                 <w:szCs w:val="18"/>
               </w:rPr>
-              <w:t xml:space="preserve">Daily opening &amp; closing; sales &amp; customer service</w:t>
+              <w:t xml:space="preserve">Daily open and close, sales and customer service</w:t>
             </w:r>
           </w:p>
           <w:p>
@@ -3173,7 +3033,7 @@
                 <w:sz w:val="18"/>
                 <w:szCs w:val="18"/>
               </w:rPr>
-              <w:t xml:space="preserve">Cash handling &amp; POS/EDC management; visual merchandising &amp; cleanliness</w:t>
+              <w:t xml:space="preserve">Cash handling and POS/EDC, plus visual merchandising and cleanliness</w:t>
             </w:r>
           </w:p>
           <w:p>
@@ -3192,7 +3052,7 @@
                 <w:sz w:val="18"/>
                 <w:szCs w:val="18"/>
               </w:rPr>
-              <w:t xml:space="preserve">Inventory reconciliation and compliance with mall &amp; Doft brand standards</w:t>
+              <w:t xml:space="preserve">Stock reconciliation, and compliance with mall and Doft standards</w:t>
             </w:r>
           </w:p>
         </w:tc>
@@ -3255,7 +3115,7 @@
                 <w:sz w:val="18"/>
                 <w:szCs w:val="18"/>
               </w:rPr>
-              <w:t xml:space="preserve">Daily reports: sales, footfall, inventory, replenishment, attendance</w:t>
+              <w:t xml:space="preserve">Daily numbers on sales, footfall, stock, replenishment and attendance</w:t>
             </w:r>
           </w:p>
           <w:p>
@@ -3274,7 +3134,7 @@
                 <w:sz w:val="18"/>
                 <w:szCs w:val="18"/>
               </w:rPr>
-              <w:t xml:space="preserve">Customer feedback and operational-issue logs</w:t>
+              <w:t xml:space="preserve">Customer feedback and a log of any operational issues</w:t>
             </w:r>
           </w:p>
           <w:p>
@@ -3293,7 +3153,7 @@
                 <w:sz w:val="18"/>
                 <w:szCs w:val="18"/>
               </w:rPr>
-              <w:t xml:space="preserve">Weekly city reviews and an end-of-season reconciliation</w:t>
+              <w:t xml:space="preserve">Weekly city reviews and a full reconciliation at the end of the season</w:t>
             </w:r>
           </w:p>
         </w:tc>
@@ -3315,7 +3175,7 @@
           <w:sz w:val="27"/>
           <w:szCs w:val="27"/>
         </w:rPr>
-        <w:t xml:space="preserve">5.  Recommended Staffing (compact 8×8 kiosk)</w:t>
+        <w:t xml:space="preserve">5.  Suggested Team for a Compact Kiosk</w:t>
       </w:r>
     </w:p>
     <w:p>
@@ -3329,27 +3189,7 @@
           <w:sz w:val="21"/>
           <w:szCs w:val="21"/>
         </w:rPr>
-        <w:t xml:space="preserve">The original brief specified 12 staff for a ~300 sq ft kiosk. As an 8 ft × 8 ft kiosk (≈ 64 sq ft) accommodates only 2–3 people on the floor at a time, we recommend a </w:t>
-      </w:r>
-      <w:r>
-        <w:rPr>
-          <w:rFonts w:ascii="Calibri" w:cs="Calibri" w:eastAsia="Calibri" w:hAnsi="Calibri"/>
-          <w:b/>
-          <w:bCs/>
-          <w:color w:val="2E2A28"/>
-          <w:sz w:val="21"/>
-          <w:szCs w:val="21"/>
-        </w:rPr>
-        <w:t xml:space="preserve">right-sized team on a two-shift roster</w:t>
-      </w:r>
-      <w:r>
-        <w:rPr>
-          <w:rFonts w:ascii="Calibri" w:cs="Calibri" w:eastAsia="Calibri" w:hAnsi="Calibri"/>
-          <w:color w:val="2E2A28"/>
-          <w:sz w:val="21"/>
-          <w:szCs w:val="21"/>
-        </w:rPr>
-        <w:t xml:space="preserve"> to cover full mall trading hours across the six weeks, with a trained bench for zero-gap cover. Final numbers are easily scaled per kiosk and city.</w:t>
+        <w:t xml:space="preserve">The original brief mentioned 12 people for a 300 sq ft kiosk. An 8x8 ft kiosk (about 64 sq ft) only holds two or three people on the floor at a time, so we suggest a smaller team on two shifts to cover full mall hours through the six weeks. We will also keep a small trained bench so a gap never stops sales. These numbers scale easily by kiosk and city.</w:t>
       </w:r>
     </w:p>
     <w:tbl>
@@ -3533,7 +3373,7 @@
                 <w:sz w:val="19"/>
                 <w:szCs w:val="19"/>
               </w:rPr>
-              <w:t xml:space="preserve">2 per shift × 2 shifts; female, 22–25, fluent English, retail experience</w:t>
+              <w:t xml:space="preserve">2 per shift, 2 shifts. Female, 22-25, fluent English, retail experience</w:t>
             </w:r>
           </w:p>
         </w:tc>
@@ -3622,7 +3462,7 @@
                 <w:sz w:val="19"/>
                 <w:szCs w:val="19"/>
               </w:rPr>
-              <w:t xml:space="preserve">POS/EDC handling; can flex as a sales executive at peak</w:t>
+              <w:t xml:space="preserve">Handles POS/EDC, can help on sales at peak hours</w:t>
             </w:r>
           </w:p>
         </w:tc>
@@ -3711,7 +3551,7 @@
                 <w:sz w:val="19"/>
                 <w:szCs w:val="19"/>
               </w:rPr>
-              <w:t xml:space="preserve">Permanent ProMarcom employee; owns daily operations</w:t>
+              <w:t xml:space="preserve">A permanent ProMarcom employee who runs the kiosk</w:t>
             </w:r>
           </w:p>
         </w:tc>
@@ -3800,7 +3640,7 @@
                 <w:sz w:val="19"/>
                 <w:szCs w:val="19"/>
               </w:rPr>
-              <w:t xml:space="preserve">Housekeeping, stock handling &amp; replenishment runs</w:t>
+              <w:t xml:space="preserve">Housekeeping, stock handling and refill runs</w:t>
             </w:r>
           </w:p>
         </w:tc>
@@ -3949,7 +3789,7 @@
                 <w:sz w:val="19"/>
                 <w:szCs w:val="19"/>
               </w:rPr>
-              <w:t xml:space="preserve">6–7</w:t>
+              <w:t xml:space="preserve">6 to 7</w:t>
             </w:r>
           </w:p>
         </w:tc>
@@ -3978,7 +3818,7 @@
                 <w:sz w:val="19"/>
                 <w:szCs w:val="19"/>
               </w:rPr>
-              <w:t xml:space="preserve">Plus a ~15% trained bench per city for immediate replacements</w:t>
+              <w:t xml:space="preserve">Plus a trained bench of about 15% per city for quick cover</w:t>
             </w:r>
           </w:p>
         </w:tc>
@@ -4000,7 +3840,7 @@
           <w:sz w:val="27"/>
           <w:szCs w:val="27"/>
         </w:rPr>
-        <w:t xml:space="preserve">6.  Reporting &amp; Governance</w:t>
+        <w:t xml:space="preserve">6.  Reporting &amp; Reviews</w:t>
       </w:r>
     </w:p>
     <w:p>
@@ -4014,7 +3854,7 @@
           <w:sz w:val="21"/>
           <w:szCs w:val="21"/>
         </w:rPr>
-        <w:t xml:space="preserve">Doft receives a standard daily report per kiosk, consolidated by city:</w:t>
+        <w:t xml:space="preserve">You will get a standard daily report per kiosk, pulled together by city. It covers:</w:t>
       </w:r>
     </w:p>
     <w:p>
@@ -4033,7 +3873,7 @@
           <w:sz w:val="21"/>
           <w:szCs w:val="21"/>
         </w:rPr>
-        <w:t xml:space="preserve">Sales — units, gross, discounts, net, bills, average bill value</w:t>
+        <w:t xml:space="preserve">Sales: units, gross, discounts, net, bills and average bill value</w:t>
       </w:r>
     </w:p>
     <w:p>
@@ -4052,7 +3892,7 @@
           <w:sz w:val="21"/>
           <w:szCs w:val="21"/>
         </w:rPr>
-        <w:t xml:space="preserve">Footfall &amp; conversion — walk-ins, engaged, bills, conversion %</w:t>
+        <w:t xml:space="preserve">Footfall and conversion: walk-ins, engaged, bills and conversion rate</w:t>
       </w:r>
     </w:p>
     <w:p>
@@ -4071,7 +3911,7 @@
           <w:sz w:val="21"/>
           <w:szCs w:val="21"/>
         </w:rPr>
-        <w:t xml:space="preserve">Inventory &amp; replenishment — opening, received, sold, closing, reorder flags</w:t>
+        <w:t xml:space="preserve">Stock and replenishment: opening, received, sold, closing and reorder flags</w:t>
       </w:r>
     </w:p>
     <w:p>
@@ -4090,7 +3930,7 @@
           <w:sz w:val="21"/>
           <w:szCs w:val="21"/>
         </w:rPr>
-        <w:t xml:space="preserve">Staff attendance — present/absent and % attendance</w:t>
+        <w:t xml:space="preserve">Attendance: present, absent and attendance rate</w:t>
       </w:r>
     </w:p>
     <w:p>
@@ -4109,24 +3949,13 @@
           <w:sz w:val="21"/>
           <w:szCs w:val="21"/>
         </w:rPr>
-        <w:t xml:space="preserve">Customer feedback and operational issues</w:t>
+        <w:t xml:space="preserve">Customer feedback and any operational issues</w:t>
       </w:r>
     </w:p>
     <w:p>
       <w:pPr>
         <w:spacing w:after="120"/>
       </w:pPr>
-      <w:r>
-        <w:rPr>
-          <w:rFonts w:ascii="Calibri" w:cs="Calibri" w:eastAsia="Calibri" w:hAnsi="Calibri"/>
-          <w:b/>
-          <w:bCs/>
-          <w:color w:val="2E2A28"/>
-          <w:sz w:val="21"/>
-          <w:szCs w:val="21"/>
-        </w:rPr>
-        <w:t xml:space="preserve">Cadence: </w:t>
-      </w:r>
       <w:r>
         <w:rPr>
           <w:rFonts w:ascii="Calibri" w:cs="Calibri" w:eastAsia="Calibri" w:hAnsi="Calibri"/>
@@ -4134,7 +3963,7 @@
           <w:sz w:val="21"/>
           <w:szCs w:val="21"/>
         </w:rPr>
-        <w:t xml:space="preserve">daily written report; a weekly review call per city; and an end-of-season reconciliation covering sales, stock returns, staffing and learnings for the next season. A live operations workbook (staffing, budget, timeline and all trackers) supports the programme.</w:t>
+        <w:t xml:space="preserve">Beyond the daily report, we will hold a weekly review call per city and a full reconciliation at the end of the season. A live operations workbook covering staffing, budget, timeline and trackers runs alongside the programme.</w:t>
       </w:r>
     </w:p>
     <w:p>
@@ -4153,7 +3982,7 @@
           <w:sz w:val="27"/>
           <w:szCs w:val="27"/>
         </w:rPr>
-        <w:t xml:space="preserve">7.  Service Commitments</w:t>
+        <w:t xml:space="preserve">7.  Our Commitments</w:t>
       </w:r>
     </w:p>
     <w:p>
@@ -4172,7 +4001,7 @@
           <w:sz w:val="21"/>
           <w:szCs w:val="21"/>
         </w:rPr>
-        <w:t xml:space="preserve">100% attendance at Doft's product &amp; sales training, with equally-trained replacements at all times.</w:t>
+        <w:t xml:space="preserve">Full attendance at your training, and equally trained staff on the floor at all times.</w:t>
       </w:r>
     </w:p>
     <w:p>
@@ -4191,7 +4020,7 @@
           <w:sz w:val="21"/>
           <w:szCs w:val="21"/>
         </w:rPr>
-        <w:t xml:space="preserve">Immediate, same-day replacement of any absent or resigned staff — at no additional cost to Doft.</w:t>
+        <w:t xml:space="preserve">Same-day replacement of any absent or resigned staff, at no extra cost to you.</w:t>
       </w:r>
     </w:p>
     <w:p>
@@ -4210,7 +4039,7 @@
           <w:sz w:val="21"/>
           <w:szCs w:val="21"/>
         </w:rPr>
-        <w:t xml:space="preserve">Uniforms kept washed, ironed and well-maintained throughout, and returned in good condition.</w:t>
+        <w:t xml:space="preserve">Uniforms kept washed, ironed and in good shape, and returned in good condition.</w:t>
       </w:r>
     </w:p>
     <w:p>
@@ -4229,7 +4058,7 @@
           <w:sz w:val="21"/>
           <w:szCs w:val="21"/>
         </w:rPr>
-        <w:t xml:space="preserve">Compliance sign-off completed before every go-live (licences, GST/e-invoicing, PF/ESIC, insurance, fire &amp; electrical, staff BGV).</w:t>
+        <w:t xml:space="preserve">Compliance signed off before every go-live: licences, GST and e-invoicing, PF and ESIC, insurance, fire and electrical, and staff background checks.</w:t>
       </w:r>
     </w:p>
     <w:p>
@@ -4248,7 +4077,7 @@
           <w:sz w:val="21"/>
           <w:szCs w:val="21"/>
         </w:rPr>
-        <w:t xml:space="preserve">Consistent service quality and brand standards across all cities operating simultaneously.</w:t>
+        <w:t xml:space="preserve">The same service quality and brand standards across every city, even when several run at once.</w:t>
       </w:r>
     </w:p>
     <w:p>
@@ -4267,7 +4096,7 @@
           <w:sz w:val="27"/>
           <w:szCs w:val="27"/>
         </w:rPr>
-        <w:t xml:space="preserve">8.  Items Supplied by Doft &amp; Assumptions</w:t>
+        <w:t xml:space="preserve">8.  What You Provide, and a Few Assumptions</w:t>
       </w:r>
     </w:p>
     <w:p>
@@ -4286,7 +4115,7 @@
           <w:sz w:val="21"/>
           <w:szCs w:val="21"/>
         </w:rPr>
-        <w:t xml:space="preserve">Doft supplies: saleable stock, the kiosk design/kit, pop-up furniture (unless otherwise agreed), POS/EDC machines, and returnable uniform shirts.</w:t>
+        <w:t xml:space="preserve">You supply the stock, the kiosk design and kit, the furniture (unless we agree otherwise), the POS/EDC machines and the uniforms (returnable).</w:t>
       </w:r>
     </w:p>
     <w:p>
@@ -4305,7 +4134,7 @@
           <w:sz w:val="21"/>
           <w:szCs w:val="21"/>
         </w:rPr>
-        <w:t xml:space="preserve">Stock is collected from Doft's Ghaziabad warehouse; insurance-in-transit and safe handling are managed by ProMarcom.</w:t>
+        <w:t xml:space="preserve">Stock is picked up from your Ghaziabad warehouse. We take care of insurance in transit and safe handling.</w:t>
       </w:r>
     </w:p>
     <w:p>
@@ -4324,7 +4153,7 @@
           <w:sz w:val="21"/>
           <w:szCs w:val="21"/>
         </w:rPr>
-        <w:t xml:space="preserve">Mall licence / space fees, if borne by ProMarcom, are treated as a pass-through / reimbursable line unless agreed otherwise — to be confirmed per mall.</w:t>
+        <w:t xml:space="preserve">If we pay any mall licence or space fees, we will bill them as a pass-through unless we agree otherwise. We will confirm this mall by mall.</w:t>
       </w:r>
     </w:p>
     <w:p>
@@ -4343,7 +4172,7 @@
           <w:sz w:val="21"/>
           <w:szCs w:val="21"/>
         </w:rPr>
-        <w:t xml:space="preserve">Final city and mall selection, kiosk count and exact go-live dates are confirmed jointly with Doft ahead of each season.</w:t>
+        <w:t xml:space="preserve">We will finalise the cities, malls, kiosk counts and go-live dates with you before each season.</w:t>
       </w:r>
     </w:p>
     <w:p>
@@ -4381,7 +4210,7 @@
           <w:sz w:val="21"/>
           <w:szCs w:val="21"/>
         </w:rPr>
-        <w:t xml:space="preserve">Doft to confirm the Phase-1 metro city list so premium mall slots can be locked early.</w:t>
+        <w:t xml:space="preserve">You confirm the Phase 1 metro cities, so we can lock premium mall slots early.</w:t>
       </w:r>
     </w:p>
     <w:p>
@@ -4400,7 +4229,7 @@
           <w:sz w:val="21"/>
           <w:szCs w:val="21"/>
         </w:rPr>
-        <w:t xml:space="preserve">ProMarcom to shortlist specific malls with availability, footfall and licence economics.</w:t>
+        <w:t xml:space="preserve">We shortlist specific malls with availability, footfall and licence cost.</w:t>
       </w:r>
     </w:p>
     <w:p>
@@ -4419,7 +4248,7 @@
           <w:sz w:val="21"/>
           <w:szCs w:val="21"/>
         </w:rPr>
-        <w:t xml:space="preserve">Align on kiosk count per city, go-live dates and the training schedule.</w:t>
+        <w:t xml:space="preserve">We agree the kiosk count per city, the go-live dates and the training schedule.</w:t>
       </w:r>
     </w:p>
     <w:p>
@@ -4438,7 +4267,7 @@
           <w:sz w:val="21"/>
           <w:szCs w:val="21"/>
         </w:rPr>
-        <w:t xml:space="preserve">Finalise commercials under a separate proposal and issue the engagement agreement.</w:t>
+        <w:t xml:space="preserve">We finalise commercials in a separate proposal and sign the agreement.</w:t>
       </w:r>
     </w:p>
     <w:p>
@@ -4454,7 +4283,7 @@
           <w:sz w:val="17"/>
           <w:szCs w:val="17"/>
         </w:rPr>
-        <w:t xml:space="preserve">Prepared by ProMarcom Inc. (EventsActive) as a planning response to the Doft Candles Diwali pop-up requirement. City and mall suggestions are indicative and subject to confirmation.</w:t>
+        <w:t xml:space="preserve">Prepared by ProMarcom Inc. (EventsActive). City and mall suggestions are indicative and will be confirmed with you.</w:t>
       </w:r>
     </w:p>
     <w:sectPr>

</xml_diff>

<commit_message>
Restore original 12-person manpower plan in Understanding doc
- Section 5 now lists the full brief team per kiosk: 6 Sales Executives,
  2 Sales Support, 1 Helper, 1 Cashier, 1 Driver, 1 Team Leader (12 total)
- Update summary row to reflect full team; keep 15% trained bench note
- Business tone retained; no em-dashes

Co-Authored-By: Claude Opus 4.8 <noreply@anthropic.com>
Claude-Session: https://claude.ai/code/session_01SPjFYHW1nTDVr5tUuToRXR
</commit_message>
<xml_diff>
--- a/doft_diwali_popup/Doft_Understanding_and_Key_Deliverables.docx
+++ b/doft_diwali_popup/Doft_Understanding_and_Key_Deliverables.docx
@@ -658,7 +658,7 @@
                 <w:sz w:val="19"/>
                 <w:szCs w:val="19"/>
               </w:rPr>
-              <w:t xml:space="preserve">A compact kiosk team on two shifts (see Section 5)</w:t>
+              <w:t xml:space="preserve">Full team of 12 per kiosk (see Section 5)</w:t>
             </w:r>
           </w:p>
         </w:tc>
@@ -3175,7 +3175,7 @@
           <w:sz w:val="27"/>
           <w:szCs w:val="27"/>
         </w:rPr>
-        <w:t xml:space="preserve">5.  Suggested Team for a Compact Kiosk</w:t>
+        <w:t xml:space="preserve">5.  Team Per Kiosk</w:t>
       </w:r>
     </w:p>
     <w:p>
@@ -3189,7 +3189,7 @@
           <w:sz w:val="21"/>
           <w:szCs w:val="21"/>
         </w:rPr>
-        <w:t xml:space="preserve">The original brief mentioned 12 people for a 300 sq ft kiosk. An 8x8 ft kiosk (about 64 sq ft) only holds two or three people on the floor at a time, so we suggest a smaller team on two shifts to cover full mall hours through the six weeks. We will also keep a small trained bench so a gap never stops sales. These numbers scale easily by kiosk and city.</w:t>
+        <w:t xml:space="preserve">We will deploy the full team specified in the brief at every kiosk: twelve people covering sales, support, cash handling, housekeeping and transport, led by a Team Leader who is a permanent ProMarcom employee. Alongside this, we will hold a trained bench of about 15% per city, so any absence is covered the same day at no extra cost to you.</w:t>
       </w:r>
     </w:p>
     <w:tbl>
@@ -3344,7 +3344,7 @@
                 <w:sz w:val="19"/>
                 <w:szCs w:val="19"/>
               </w:rPr>
-              <w:t xml:space="preserve">4</w:t>
+              <w:t xml:space="preserve">6</w:t>
             </w:r>
           </w:p>
         </w:tc>
@@ -3373,7 +3373,7 @@
                 <w:sz w:val="19"/>
                 <w:szCs w:val="19"/>
               </w:rPr>
-              <w:t xml:space="preserve">2 per shift, 2 shifts. Female, 22-25, fluent English, retail experience</w:t>
+              <w:t xml:space="preserve">Female, 22-25, fluent English, retail sales experience</w:t>
             </w:r>
           </w:p>
         </w:tc>
@@ -3404,7 +3404,7 @@
                 <w:sz w:val="19"/>
                 <w:szCs w:val="19"/>
               </w:rPr>
-              <w:t xml:space="preserve">Cashier</w:t>
+              <w:t xml:space="preserve">Sales Support Staff</w:t>
             </w:r>
           </w:p>
         </w:tc>
@@ -3433,7 +3433,7 @@
                 <w:sz w:val="19"/>
                 <w:szCs w:val="19"/>
               </w:rPr>
-              <w:t xml:space="preserve">1</w:t>
+              <w:t xml:space="preserve">2</w:t>
             </w:r>
           </w:p>
         </w:tc>
@@ -3462,7 +3462,7 @@
                 <w:sz w:val="19"/>
                 <w:szCs w:val="19"/>
               </w:rPr>
-              <w:t xml:space="preserve">Handles POS/EDC, can help on sales at peak hours</w:t>
+              <w:t xml:space="preserve">Merchandising, stock handling and queue management</w:t>
             </w:r>
           </w:p>
         </w:tc>
@@ -3493,7 +3493,7 @@
                 <w:sz w:val="19"/>
                 <w:szCs w:val="19"/>
               </w:rPr>
-              <w:t xml:space="preserve">Team Leader / Manager</w:t>
+              <w:t xml:space="preserve">Helper</w:t>
             </w:r>
           </w:p>
         </w:tc>
@@ -3551,7 +3551,7 @@
                 <w:sz w:val="19"/>
                 <w:szCs w:val="19"/>
               </w:rPr>
-              <w:t xml:space="preserve">A permanent ProMarcom employee who runs the kiosk</w:t>
+              <w:t xml:space="preserve">Housekeeping and material handling</w:t>
             </w:r>
           </w:p>
         </w:tc>
@@ -3582,7 +3582,7 @@
                 <w:sz w:val="19"/>
                 <w:szCs w:val="19"/>
               </w:rPr>
-              <w:t xml:space="preserve">Helper / Support</w:t>
+              <w:t xml:space="preserve">Cashier</w:t>
             </w:r>
           </w:p>
         </w:tc>
@@ -3640,7 +3640,7 @@
                 <w:sz w:val="19"/>
                 <w:szCs w:val="19"/>
               </w:rPr>
-              <w:t xml:space="preserve">Housekeeping, stock handling and refill runs</w:t>
+              <w:t xml:space="preserve">Experienced on POS/EDC machines</w:t>
             </w:r>
           </w:p>
         </w:tc>
@@ -3671,7 +3671,7 @@
                 <w:sz w:val="19"/>
                 <w:szCs w:val="19"/>
               </w:rPr>
-              <w:t xml:space="preserve">Driver (shared)</w:t>
+              <w:t xml:space="preserve">Driver</w:t>
             </w:r>
           </w:p>
         </w:tc>
@@ -3700,7 +3700,7 @@
                 <w:sz w:val="19"/>
                 <w:szCs w:val="19"/>
               </w:rPr>
-              <w:t xml:space="preserve">1 per city</w:t>
+              <w:t xml:space="preserve">1</w:t>
             </w:r>
           </w:p>
         </w:tc>
@@ -3729,7 +3729,7 @@
                 <w:sz w:val="19"/>
                 <w:szCs w:val="19"/>
               </w:rPr>
-              <w:t xml:space="preserve">Shared across a city's kiosks for stock movement</w:t>
+              <w:t xml:space="preserve">Stock transport and replenishment runs</w:t>
             </w:r>
           </w:p>
         </w:tc>
@@ -3738,6 +3738,95 @@
         <w:tc>
           <w:tcPr>
             <w:tcW w:type="dxa" w:w="3000"/>
+            <w:shd w:fill="FFFFFF" w:color="auto" w:val="clear"/>
+            <w:tcMar>
+              <w:top w:type="dxa" w:w="70"/>
+              <w:left w:type="dxa" w:w="110"/>
+              <w:bottom w:type="dxa" w:w="70"/>
+              <w:right w:type="dxa" w:w="110"/>
+            </w:tcMar>
+            <w:vAlign w:val="center"/>
+          </w:tcPr>
+          <w:p>
+            <w:pPr>
+              <w:spacing w:after="0"/>
+            </w:pPr>
+            <w:r>
+              <w:rPr>
+                <w:rFonts w:ascii="Calibri" w:cs="Calibri" w:eastAsia="Calibri" w:hAnsi="Calibri"/>
+                <w:b/>
+                <w:bCs/>
+                <w:color w:val="2E2A28"/>
+                <w:sz w:val="19"/>
+                <w:szCs w:val="19"/>
+              </w:rPr>
+              <w:t xml:space="preserve">Team Leader / Manager</w:t>
+            </w:r>
+          </w:p>
+        </w:tc>
+        <w:tc>
+          <w:tcPr>
+            <w:tcW w:type="dxa" w:w="1500"/>
+            <w:shd w:fill="FFFFFF" w:color="auto" w:val="clear"/>
+            <w:tcMar>
+              <w:top w:type="dxa" w:w="70"/>
+              <w:left w:type="dxa" w:w="110"/>
+              <w:bottom w:type="dxa" w:w="70"/>
+              <w:right w:type="dxa" w:w="110"/>
+            </w:tcMar>
+            <w:vAlign w:val="center"/>
+          </w:tcPr>
+          <w:p>
+            <w:pPr>
+              <w:spacing w:after="0"/>
+            </w:pPr>
+            <w:r>
+              <w:rPr>
+                <w:rFonts w:ascii="Calibri" w:cs="Calibri" w:eastAsia="Calibri" w:hAnsi="Calibri"/>
+                <w:b w:val="false"/>
+                <w:bCs w:val="false"/>
+                <w:color w:val="2E2A28"/>
+                <w:sz w:val="19"/>
+                <w:szCs w:val="19"/>
+              </w:rPr>
+              <w:t xml:space="preserve">1</w:t>
+            </w:r>
+          </w:p>
+        </w:tc>
+        <w:tc>
+          <w:tcPr>
+            <w:tcW w:type="dxa" w:w="4520"/>
+            <w:shd w:fill="FFFFFF" w:color="auto" w:val="clear"/>
+            <w:tcMar>
+              <w:top w:type="dxa" w:w="70"/>
+              <w:left w:type="dxa" w:w="110"/>
+              <w:bottom w:type="dxa" w:w="70"/>
+              <w:right w:type="dxa" w:w="110"/>
+            </w:tcMar>
+            <w:vAlign w:val="center"/>
+          </w:tcPr>
+          <w:p>
+            <w:pPr>
+              <w:spacing w:after="0"/>
+            </w:pPr>
+            <w:r>
+              <w:rPr>
+                <w:rFonts w:ascii="Calibri" w:cs="Calibri" w:eastAsia="Calibri" w:hAnsi="Calibri"/>
+                <w:b w:val="false"/>
+                <w:bCs w:val="false"/>
+                <w:color w:val="2E2A28"/>
+                <w:sz w:val="19"/>
+                <w:szCs w:val="19"/>
+              </w:rPr>
+              <w:t xml:space="preserve">Permanent ProMarcom employee who runs the kiosk</w:t>
+            </w:r>
+          </w:p>
+        </w:tc>
+      </w:tr>
+      <w:tr>
+        <w:tc>
+          <w:tcPr>
+            <w:tcW w:type="dxa" w:w="3000"/>
             <w:shd w:fill="EADFCE" w:color="auto" w:val="clear"/>
             <w:tcMar>
               <w:top w:type="dxa" w:w="70"/>
@@ -3760,7 +3849,7 @@
                 <w:sz w:val="19"/>
                 <w:szCs w:val="19"/>
               </w:rPr>
-              <w:t xml:space="preserve">Core team per kiosk</w:t>
+              <w:t xml:space="preserve">Total per kiosk</w:t>
             </w:r>
           </w:p>
         </w:tc>
@@ -3789,7 +3878,7 @@
                 <w:sz w:val="19"/>
                 <w:szCs w:val="19"/>
               </w:rPr>
-              <w:t xml:space="preserve">6 to 7</w:t>
+              <w:t xml:space="preserve">12</w:t>
             </w:r>
           </w:p>
         </w:tc>

</xml_diff>

<commit_message>
Add Indicative Timeline section to Understanding doc
- New Section 6: phase-by-phase timeline relative to each city's go-live (6-week window)
- Renumber subsequent sections (Reporting 7, Commitments 8, Provisions 9, Next Steps 10)

Co-Authored-By: Claude Opus 4.8 <noreply@anthropic.com>
Claude-Session: https://claude.ai/code/session_01SPjFYHW1nTDVr5tUuToRXR
</commit_message>
<xml_diff>
--- a/doft_diwali_popup/Doft_Understanding_and_Key_Deliverables.docx
+++ b/doft_diwali_popup/Doft_Understanding_and_Key_Deliverables.docx
@@ -3929,7 +3929,955 @@
           <w:sz w:val="27"/>
           <w:szCs w:val="27"/>
         </w:rPr>
-        <w:t xml:space="preserve">6.  Reporting &amp; Reviews</w:t>
+        <w:t xml:space="preserve">6.  Indicative Timeline</w:t>
+      </w:r>
+    </w:p>
+    <w:p>
+      <w:pPr>
+        <w:spacing w:after="120"/>
+      </w:pPr>
+      <w:r>
+        <w:rPr>
+          <w:rFonts w:ascii="Calibri" w:cs="Calibri" w:eastAsia="Calibri" w:hAnsi="Calibri"/>
+          <w:color w:val="2E2A28"/>
+          <w:sz w:val="21"/>
+          <w:szCs w:val="21"/>
+        </w:rPr>
+        <w:t xml:space="preserve">The plan below is shown relative to each city's go-live (T), with a six-week trading window. Metros launch first, and sub-metros follow either later in the same season or the next, so exact calendar dates are fixed per city once malls are confirmed.</w:t>
+      </w:r>
+    </w:p>
+    <w:tbl>
+      <w:tblPr>
+        <w:tblW w:type="dxa" w:w="9020"/>
+        <w:tblBorders>
+          <w:top w:val="single" w:color="D9CFC0" w:sz="2"/>
+          <w:left w:val="single" w:color="D9CFC0" w:sz="2"/>
+          <w:bottom w:val="single" w:color="D9CFC0" w:sz="2"/>
+          <w:right w:val="single" w:color="D9CFC0" w:sz="2"/>
+          <w:insideH w:val="single" w:color="D9CFC0" w:sz="2"/>
+          <w:insideV w:val="single" w:color="D9CFC0" w:sz="2"/>
+        </w:tblBorders>
+      </w:tblPr>
+      <w:tblGrid>
+        <w:gridCol w:w="4600"/>
+        <w:gridCol w:w="2600"/>
+        <w:gridCol w:w="1820"/>
+      </w:tblGrid>
+      <w:tr>
+        <w:tc>
+          <w:tcPr>
+            <w:tcW w:type="dxa" w:w="4600"/>
+            <w:shd w:fill="4A343A" w:color="auto" w:val="clear"/>
+            <w:tcMar>
+              <w:top w:type="dxa" w:w="70"/>
+              <w:left w:type="dxa" w:w="110"/>
+              <w:bottom w:type="dxa" w:w="70"/>
+              <w:right w:type="dxa" w:w="110"/>
+            </w:tcMar>
+            <w:vAlign w:val="center"/>
+          </w:tcPr>
+          <w:p>
+            <w:r>
+              <w:rPr>
+                <w:rFonts w:ascii="Calibri" w:cs="Calibri" w:eastAsia="Calibri" w:hAnsi="Calibri"/>
+                <w:b/>
+                <w:bCs/>
+                <w:color w:val="FFFFFF"/>
+                <w:sz w:val="19"/>
+                <w:szCs w:val="19"/>
+              </w:rPr>
+              <w:t xml:space="preserve">Phase / Activity</w:t>
+            </w:r>
+          </w:p>
+        </w:tc>
+        <w:tc>
+          <w:tcPr>
+            <w:tcW w:type="dxa" w:w="2600"/>
+            <w:shd w:fill="4A343A" w:color="auto" w:val="clear"/>
+            <w:tcMar>
+              <w:top w:type="dxa" w:w="70"/>
+              <w:left w:type="dxa" w:w="110"/>
+              <w:bottom w:type="dxa" w:w="70"/>
+              <w:right w:type="dxa" w:w="110"/>
+            </w:tcMar>
+            <w:vAlign w:val="center"/>
+          </w:tcPr>
+          <w:p>
+            <w:r>
+              <w:rPr>
+                <w:rFonts w:ascii="Calibri" w:cs="Calibri" w:eastAsia="Calibri" w:hAnsi="Calibri"/>
+                <w:b/>
+                <w:bCs/>
+                <w:color w:val="FFFFFF"/>
+                <w:sz w:val="19"/>
+                <w:szCs w:val="19"/>
+              </w:rPr>
+              <w:t xml:space="preserve">Timing</w:t>
+            </w:r>
+          </w:p>
+        </w:tc>
+        <w:tc>
+          <w:tcPr>
+            <w:tcW w:type="dxa" w:w="1820"/>
+            <w:shd w:fill="4A343A" w:color="auto" w:val="clear"/>
+            <w:tcMar>
+              <w:top w:type="dxa" w:w="70"/>
+              <w:left w:type="dxa" w:w="110"/>
+              <w:bottom w:type="dxa" w:w="70"/>
+              <w:right w:type="dxa" w:w="110"/>
+            </w:tcMar>
+            <w:vAlign w:val="center"/>
+          </w:tcPr>
+          <w:p>
+            <w:r>
+              <w:rPr>
+                <w:rFonts w:ascii="Calibri" w:cs="Calibri" w:eastAsia="Calibri" w:hAnsi="Calibri"/>
+                <w:b/>
+                <w:bCs/>
+                <w:color w:val="FFFFFF"/>
+                <w:sz w:val="19"/>
+                <w:szCs w:val="19"/>
+              </w:rPr>
+              <w:t xml:space="preserve">Owner</w:t>
+            </w:r>
+          </w:p>
+        </w:tc>
+      </w:tr>
+      <w:tr>
+        <w:tc>
+          <w:tcPr>
+            <w:tcW w:type="dxa" w:w="4600"/>
+            <w:shd w:fill="F3EEE6" w:color="auto" w:val="clear"/>
+            <w:tcMar>
+              <w:top w:type="dxa" w:w="70"/>
+              <w:left w:type="dxa" w:w="110"/>
+              <w:bottom w:type="dxa" w:w="70"/>
+              <w:right w:type="dxa" w:w="110"/>
+            </w:tcMar>
+            <w:vAlign w:val="center"/>
+          </w:tcPr>
+          <w:p>
+            <w:pPr>
+              <w:spacing w:after="0"/>
+            </w:pPr>
+            <w:r>
+              <w:rPr>
+                <w:rFonts w:ascii="Calibri" w:cs="Calibri" w:eastAsia="Calibri" w:hAnsi="Calibri"/>
+                <w:b/>
+                <w:bCs/>
+                <w:color w:val="2E2A28"/>
+                <w:sz w:val="19"/>
+                <w:szCs w:val="19"/>
+              </w:rPr>
+              <w:t xml:space="preserve">Contract award and kick-off</w:t>
+            </w:r>
+          </w:p>
+        </w:tc>
+        <w:tc>
+          <w:tcPr>
+            <w:tcW w:type="dxa" w:w="2600"/>
+            <w:shd w:fill="F3EEE6" w:color="auto" w:val="clear"/>
+            <w:tcMar>
+              <w:top w:type="dxa" w:w="70"/>
+              <w:left w:type="dxa" w:w="110"/>
+              <w:bottom w:type="dxa" w:w="70"/>
+              <w:right w:type="dxa" w:w="110"/>
+            </w:tcMar>
+            <w:vAlign w:val="center"/>
+          </w:tcPr>
+          <w:p>
+            <w:pPr>
+              <w:spacing w:after="0"/>
+            </w:pPr>
+            <w:r>
+              <w:rPr>
+                <w:rFonts w:ascii="Calibri" w:cs="Calibri" w:eastAsia="Calibri" w:hAnsi="Calibri"/>
+                <w:b w:val="false"/>
+                <w:bCs w:val="false"/>
+                <w:color w:val="2E2A28"/>
+                <w:sz w:val="19"/>
+                <w:szCs w:val="19"/>
+              </w:rPr>
+              <w:t xml:space="preserve">T minus 8 weeks</w:t>
+            </w:r>
+          </w:p>
+        </w:tc>
+        <w:tc>
+          <w:tcPr>
+            <w:tcW w:type="dxa" w:w="1820"/>
+            <w:shd w:fill="F3EEE6" w:color="auto" w:val="clear"/>
+            <w:tcMar>
+              <w:top w:type="dxa" w:w="70"/>
+              <w:left w:type="dxa" w:w="110"/>
+              <w:bottom w:type="dxa" w:w="70"/>
+              <w:right w:type="dxa" w:w="110"/>
+            </w:tcMar>
+            <w:vAlign w:val="center"/>
+          </w:tcPr>
+          <w:p>
+            <w:pPr>
+              <w:spacing w:after="0"/>
+            </w:pPr>
+            <w:r>
+              <w:rPr>
+                <w:rFonts w:ascii="Calibri" w:cs="Calibri" w:eastAsia="Calibri" w:hAnsi="Calibri"/>
+                <w:b w:val="false"/>
+                <w:bCs w:val="false"/>
+                <w:color w:val="2E2A28"/>
+                <w:sz w:val="19"/>
+                <w:szCs w:val="19"/>
+              </w:rPr>
+              <w:t xml:space="preserve">Doft + ProMarcom</w:t>
+            </w:r>
+          </w:p>
+        </w:tc>
+      </w:tr>
+      <w:tr>
+        <w:tc>
+          <w:tcPr>
+            <w:tcW w:type="dxa" w:w="4600"/>
+            <w:shd w:fill="FFFFFF" w:color="auto" w:val="clear"/>
+            <w:tcMar>
+              <w:top w:type="dxa" w:w="70"/>
+              <w:left w:type="dxa" w:w="110"/>
+              <w:bottom w:type="dxa" w:w="70"/>
+              <w:right w:type="dxa" w:w="110"/>
+            </w:tcMar>
+            <w:vAlign w:val="center"/>
+          </w:tcPr>
+          <w:p>
+            <w:pPr>
+              <w:spacing w:after="0"/>
+            </w:pPr>
+            <w:r>
+              <w:rPr>
+                <w:rFonts w:ascii="Calibri" w:cs="Calibri" w:eastAsia="Calibri" w:hAnsi="Calibri"/>
+                <w:b/>
+                <w:bCs/>
+                <w:color w:val="2E2A28"/>
+                <w:sz w:val="19"/>
+                <w:szCs w:val="19"/>
+              </w:rPr>
+              <w:t xml:space="preserve">Mall shortlisting and licence applications</w:t>
+            </w:r>
+          </w:p>
+        </w:tc>
+        <w:tc>
+          <w:tcPr>
+            <w:tcW w:type="dxa" w:w="2600"/>
+            <w:shd w:fill="FFFFFF" w:color="auto" w:val="clear"/>
+            <w:tcMar>
+              <w:top w:type="dxa" w:w="70"/>
+              <w:left w:type="dxa" w:w="110"/>
+              <w:bottom w:type="dxa" w:w="70"/>
+              <w:right w:type="dxa" w:w="110"/>
+            </w:tcMar>
+            <w:vAlign w:val="center"/>
+          </w:tcPr>
+          <w:p>
+            <w:pPr>
+              <w:spacing w:after="0"/>
+            </w:pPr>
+            <w:r>
+              <w:rPr>
+                <w:rFonts w:ascii="Calibri" w:cs="Calibri" w:eastAsia="Calibri" w:hAnsi="Calibri"/>
+                <w:b w:val="false"/>
+                <w:bCs w:val="false"/>
+                <w:color w:val="2E2A28"/>
+                <w:sz w:val="19"/>
+                <w:szCs w:val="19"/>
+              </w:rPr>
+              <w:t xml:space="preserve">T minus 7 to 4 weeks</w:t>
+            </w:r>
+          </w:p>
+        </w:tc>
+        <w:tc>
+          <w:tcPr>
+            <w:tcW w:type="dxa" w:w="1820"/>
+            <w:shd w:fill="FFFFFF" w:color="auto" w:val="clear"/>
+            <w:tcMar>
+              <w:top w:type="dxa" w:w="70"/>
+              <w:left w:type="dxa" w:w="110"/>
+              <w:bottom w:type="dxa" w:w="70"/>
+              <w:right w:type="dxa" w:w="110"/>
+            </w:tcMar>
+            <w:vAlign w:val="center"/>
+          </w:tcPr>
+          <w:p>
+            <w:pPr>
+              <w:spacing w:after="0"/>
+            </w:pPr>
+            <w:r>
+              <w:rPr>
+                <w:rFonts w:ascii="Calibri" w:cs="Calibri" w:eastAsia="Calibri" w:hAnsi="Calibri"/>
+                <w:b w:val="false"/>
+                <w:bCs w:val="false"/>
+                <w:color w:val="2E2A28"/>
+                <w:sz w:val="19"/>
+                <w:szCs w:val="19"/>
+              </w:rPr>
+              <w:t xml:space="preserve">ProMarcom</w:t>
+            </w:r>
+          </w:p>
+        </w:tc>
+      </w:tr>
+      <w:tr>
+        <w:tc>
+          <w:tcPr>
+            <w:tcW w:type="dxa" w:w="4600"/>
+            <w:shd w:fill="F3EEE6" w:color="auto" w:val="clear"/>
+            <w:tcMar>
+              <w:top w:type="dxa" w:w="70"/>
+              <w:left w:type="dxa" w:w="110"/>
+              <w:bottom w:type="dxa" w:w="70"/>
+              <w:right w:type="dxa" w:w="110"/>
+            </w:tcMar>
+            <w:vAlign w:val="center"/>
+          </w:tcPr>
+          <w:p>
+            <w:pPr>
+              <w:spacing w:after="0"/>
+            </w:pPr>
+            <w:r>
+              <w:rPr>
+                <w:rFonts w:ascii="Calibri" w:cs="Calibri" w:eastAsia="Calibri" w:hAnsi="Calibri"/>
+                <w:b/>
+                <w:bCs/>
+                <w:color w:val="2E2A28"/>
+                <w:sz w:val="19"/>
+                <w:szCs w:val="19"/>
+              </w:rPr>
+              <w:t xml:space="preserve">Recruitment and background checks</w:t>
+            </w:r>
+          </w:p>
+        </w:tc>
+        <w:tc>
+          <w:tcPr>
+            <w:tcW w:type="dxa" w:w="2600"/>
+            <w:shd w:fill="F3EEE6" w:color="auto" w:val="clear"/>
+            <w:tcMar>
+              <w:top w:type="dxa" w:w="70"/>
+              <w:left w:type="dxa" w:w="110"/>
+              <w:bottom w:type="dxa" w:w="70"/>
+              <w:right w:type="dxa" w:w="110"/>
+            </w:tcMar>
+            <w:vAlign w:val="center"/>
+          </w:tcPr>
+          <w:p>
+            <w:pPr>
+              <w:spacing w:after="0"/>
+            </w:pPr>
+            <w:r>
+              <w:rPr>
+                <w:rFonts w:ascii="Calibri" w:cs="Calibri" w:eastAsia="Calibri" w:hAnsi="Calibri"/>
+                <w:b w:val="false"/>
+                <w:bCs w:val="false"/>
+                <w:color w:val="2E2A28"/>
+                <w:sz w:val="19"/>
+                <w:szCs w:val="19"/>
+              </w:rPr>
+              <w:t xml:space="preserve">T minus 6 to 2 weeks</w:t>
+            </w:r>
+          </w:p>
+        </w:tc>
+        <w:tc>
+          <w:tcPr>
+            <w:tcW w:type="dxa" w:w="1820"/>
+            <w:shd w:fill="F3EEE6" w:color="auto" w:val="clear"/>
+            <w:tcMar>
+              <w:top w:type="dxa" w:w="70"/>
+              <w:left w:type="dxa" w:w="110"/>
+              <w:bottom w:type="dxa" w:w="70"/>
+              <w:right w:type="dxa" w:w="110"/>
+            </w:tcMar>
+            <w:vAlign w:val="center"/>
+          </w:tcPr>
+          <w:p>
+            <w:pPr>
+              <w:spacing w:after="0"/>
+            </w:pPr>
+            <w:r>
+              <w:rPr>
+                <w:rFonts w:ascii="Calibri" w:cs="Calibri" w:eastAsia="Calibri" w:hAnsi="Calibri"/>
+                <w:b w:val="false"/>
+                <w:bCs w:val="false"/>
+                <w:color w:val="2E2A28"/>
+                <w:sz w:val="19"/>
+                <w:szCs w:val="19"/>
+              </w:rPr>
+              <w:t xml:space="preserve">ProMarcom</w:t>
+            </w:r>
+          </w:p>
+        </w:tc>
+      </w:tr>
+      <w:tr>
+        <w:tc>
+          <w:tcPr>
+            <w:tcW w:type="dxa" w:w="4600"/>
+            <w:shd w:fill="FFFFFF" w:color="auto" w:val="clear"/>
+            <w:tcMar>
+              <w:top w:type="dxa" w:w="70"/>
+              <w:left w:type="dxa" w:w="110"/>
+              <w:bottom w:type="dxa" w:w="70"/>
+              <w:right w:type="dxa" w:w="110"/>
+            </w:tcMar>
+            <w:vAlign w:val="center"/>
+          </w:tcPr>
+          <w:p>
+            <w:pPr>
+              <w:spacing w:after="0"/>
+            </w:pPr>
+            <w:r>
+              <w:rPr>
+                <w:rFonts w:ascii="Calibri" w:cs="Calibri" w:eastAsia="Calibri" w:hAnsi="Calibri"/>
+                <w:b/>
+                <w:bCs/>
+                <w:color w:val="2E2A28"/>
+                <w:sz w:val="19"/>
+                <w:szCs w:val="19"/>
+              </w:rPr>
+              <w:t xml:space="preserve">Kiosk fabrication and fit-out</w:t>
+            </w:r>
+          </w:p>
+        </w:tc>
+        <w:tc>
+          <w:tcPr>
+            <w:tcW w:type="dxa" w:w="2600"/>
+            <w:shd w:fill="FFFFFF" w:color="auto" w:val="clear"/>
+            <w:tcMar>
+              <w:top w:type="dxa" w:w="70"/>
+              <w:left w:type="dxa" w:w="110"/>
+              <w:bottom w:type="dxa" w:w="70"/>
+              <w:right w:type="dxa" w:w="110"/>
+            </w:tcMar>
+            <w:vAlign w:val="center"/>
+          </w:tcPr>
+          <w:p>
+            <w:pPr>
+              <w:spacing w:after="0"/>
+            </w:pPr>
+            <w:r>
+              <w:rPr>
+                <w:rFonts w:ascii="Calibri" w:cs="Calibri" w:eastAsia="Calibri" w:hAnsi="Calibri"/>
+                <w:b w:val="false"/>
+                <w:bCs w:val="false"/>
+                <w:color w:val="2E2A28"/>
+                <w:sz w:val="19"/>
+                <w:szCs w:val="19"/>
+              </w:rPr>
+              <w:t xml:space="preserve">T minus 3 to 1 weeks</w:t>
+            </w:r>
+          </w:p>
+        </w:tc>
+        <w:tc>
+          <w:tcPr>
+            <w:tcW w:type="dxa" w:w="1820"/>
+            <w:shd w:fill="FFFFFF" w:color="auto" w:val="clear"/>
+            <w:tcMar>
+              <w:top w:type="dxa" w:w="70"/>
+              <w:left w:type="dxa" w:w="110"/>
+              <w:bottom w:type="dxa" w:w="70"/>
+              <w:right w:type="dxa" w:w="110"/>
+            </w:tcMar>
+            <w:vAlign w:val="center"/>
+          </w:tcPr>
+          <w:p>
+            <w:pPr>
+              <w:spacing w:after="0"/>
+            </w:pPr>
+            <w:r>
+              <w:rPr>
+                <w:rFonts w:ascii="Calibri" w:cs="Calibri" w:eastAsia="Calibri" w:hAnsi="Calibri"/>
+                <w:b w:val="false"/>
+                <w:bCs w:val="false"/>
+                <w:color w:val="2E2A28"/>
+                <w:sz w:val="19"/>
+                <w:szCs w:val="19"/>
+              </w:rPr>
+              <w:t xml:space="preserve">ProMarcom</w:t>
+            </w:r>
+          </w:p>
+        </w:tc>
+      </w:tr>
+      <w:tr>
+        <w:tc>
+          <w:tcPr>
+            <w:tcW w:type="dxa" w:w="4600"/>
+            <w:shd w:fill="F3EEE6" w:color="auto" w:val="clear"/>
+            <w:tcMar>
+              <w:top w:type="dxa" w:w="70"/>
+              <w:left w:type="dxa" w:w="110"/>
+              <w:bottom w:type="dxa" w:w="70"/>
+              <w:right w:type="dxa" w:w="110"/>
+            </w:tcMar>
+            <w:vAlign w:val="center"/>
+          </w:tcPr>
+          <w:p>
+            <w:pPr>
+              <w:spacing w:after="0"/>
+            </w:pPr>
+            <w:r>
+              <w:rPr>
+                <w:rFonts w:ascii="Calibri" w:cs="Calibri" w:eastAsia="Calibri" w:hAnsi="Calibri"/>
+                <w:b/>
+                <w:bCs/>
+                <w:color w:val="2E2A28"/>
+                <w:sz w:val="19"/>
+                <w:szCs w:val="19"/>
+              </w:rPr>
+              <w:t xml:space="preserve">Doft product and sales training (1 day)</w:t>
+            </w:r>
+          </w:p>
+        </w:tc>
+        <w:tc>
+          <w:tcPr>
+            <w:tcW w:type="dxa" w:w="2600"/>
+            <w:shd w:fill="F3EEE6" w:color="auto" w:val="clear"/>
+            <w:tcMar>
+              <w:top w:type="dxa" w:w="70"/>
+              <w:left w:type="dxa" w:w="110"/>
+              <w:bottom w:type="dxa" w:w="70"/>
+              <w:right w:type="dxa" w:w="110"/>
+            </w:tcMar>
+            <w:vAlign w:val="center"/>
+          </w:tcPr>
+          <w:p>
+            <w:pPr>
+              <w:spacing w:after="0"/>
+            </w:pPr>
+            <w:r>
+              <w:rPr>
+                <w:rFonts w:ascii="Calibri" w:cs="Calibri" w:eastAsia="Calibri" w:hAnsi="Calibri"/>
+                <w:b w:val="false"/>
+                <w:bCs w:val="false"/>
+                <w:color w:val="2E2A28"/>
+                <w:sz w:val="19"/>
+                <w:szCs w:val="19"/>
+              </w:rPr>
+              <w:t xml:space="preserve">T minus 2 weeks</w:t>
+            </w:r>
+          </w:p>
+        </w:tc>
+        <w:tc>
+          <w:tcPr>
+            <w:tcW w:type="dxa" w:w="1820"/>
+            <w:shd w:fill="F3EEE6" w:color="auto" w:val="clear"/>
+            <w:tcMar>
+              <w:top w:type="dxa" w:w="70"/>
+              <w:left w:type="dxa" w:w="110"/>
+              <w:bottom w:type="dxa" w:w="70"/>
+              <w:right w:type="dxa" w:w="110"/>
+            </w:tcMar>
+            <w:vAlign w:val="center"/>
+          </w:tcPr>
+          <w:p>
+            <w:pPr>
+              <w:spacing w:after="0"/>
+            </w:pPr>
+            <w:r>
+              <w:rPr>
+                <w:rFonts w:ascii="Calibri" w:cs="Calibri" w:eastAsia="Calibri" w:hAnsi="Calibri"/>
+                <w:b w:val="false"/>
+                <w:bCs w:val="false"/>
+                <w:color w:val="2E2A28"/>
+                <w:sz w:val="19"/>
+                <w:szCs w:val="19"/>
+              </w:rPr>
+              <w:t xml:space="preserve">Doft</w:t>
+            </w:r>
+          </w:p>
+        </w:tc>
+      </w:tr>
+      <w:tr>
+        <w:tc>
+          <w:tcPr>
+            <w:tcW w:type="dxa" w:w="4600"/>
+            <w:shd w:fill="FFFFFF" w:color="auto" w:val="clear"/>
+            <w:tcMar>
+              <w:top w:type="dxa" w:w="70"/>
+              <w:left w:type="dxa" w:w="110"/>
+              <w:bottom w:type="dxa" w:w="70"/>
+              <w:right w:type="dxa" w:w="110"/>
+            </w:tcMar>
+            <w:vAlign w:val="center"/>
+          </w:tcPr>
+          <w:p>
+            <w:pPr>
+              <w:spacing w:after="0"/>
+            </w:pPr>
+            <w:r>
+              <w:rPr>
+                <w:rFonts w:ascii="Calibri" w:cs="Calibri" w:eastAsia="Calibri" w:hAnsi="Calibri"/>
+                <w:b/>
+                <w:bCs/>
+                <w:color w:val="2E2A28"/>
+                <w:sz w:val="19"/>
+                <w:szCs w:val="19"/>
+              </w:rPr>
+              <w:t xml:space="preserve">Stock pickup from Ghaziabad and first fill</w:t>
+            </w:r>
+          </w:p>
+        </w:tc>
+        <w:tc>
+          <w:tcPr>
+            <w:tcW w:type="dxa" w:w="2600"/>
+            <w:shd w:fill="FFFFFF" w:color="auto" w:val="clear"/>
+            <w:tcMar>
+              <w:top w:type="dxa" w:w="70"/>
+              <w:left w:type="dxa" w:w="110"/>
+              <w:bottom w:type="dxa" w:w="70"/>
+              <w:right w:type="dxa" w:w="110"/>
+            </w:tcMar>
+            <w:vAlign w:val="center"/>
+          </w:tcPr>
+          <w:p>
+            <w:pPr>
+              <w:spacing w:after="0"/>
+            </w:pPr>
+            <w:r>
+              <w:rPr>
+                <w:rFonts w:ascii="Calibri" w:cs="Calibri" w:eastAsia="Calibri" w:hAnsi="Calibri"/>
+                <w:b w:val="false"/>
+                <w:bCs w:val="false"/>
+                <w:color w:val="2E2A28"/>
+                <w:sz w:val="19"/>
+                <w:szCs w:val="19"/>
+              </w:rPr>
+              <w:t xml:space="preserve">T minus 1 week</w:t>
+            </w:r>
+          </w:p>
+        </w:tc>
+        <w:tc>
+          <w:tcPr>
+            <w:tcW w:type="dxa" w:w="1820"/>
+            <w:shd w:fill="FFFFFF" w:color="auto" w:val="clear"/>
+            <w:tcMar>
+              <w:top w:type="dxa" w:w="70"/>
+              <w:left w:type="dxa" w:w="110"/>
+              <w:bottom w:type="dxa" w:w="70"/>
+              <w:right w:type="dxa" w:w="110"/>
+            </w:tcMar>
+            <w:vAlign w:val="center"/>
+          </w:tcPr>
+          <w:p>
+            <w:pPr>
+              <w:spacing w:after="0"/>
+            </w:pPr>
+            <w:r>
+              <w:rPr>
+                <w:rFonts w:ascii="Calibri" w:cs="Calibri" w:eastAsia="Calibri" w:hAnsi="Calibri"/>
+                <w:b w:val="false"/>
+                <w:bCs w:val="false"/>
+                <w:color w:val="2E2A28"/>
+                <w:sz w:val="19"/>
+                <w:szCs w:val="19"/>
+              </w:rPr>
+              <w:t xml:space="preserve">ProMarcom</w:t>
+            </w:r>
+          </w:p>
+        </w:tc>
+      </w:tr>
+      <w:tr>
+        <w:tc>
+          <w:tcPr>
+            <w:tcW w:type="dxa" w:w="4600"/>
+            <w:shd w:fill="F3EEE6" w:color="auto" w:val="clear"/>
+            <w:tcMar>
+              <w:top w:type="dxa" w:w="70"/>
+              <w:left w:type="dxa" w:w="110"/>
+              <w:bottom w:type="dxa" w:w="70"/>
+              <w:right w:type="dxa" w:w="110"/>
+            </w:tcMar>
+            <w:vAlign w:val="center"/>
+          </w:tcPr>
+          <w:p>
+            <w:pPr>
+              <w:spacing w:after="0"/>
+            </w:pPr>
+            <w:r>
+              <w:rPr>
+                <w:rFonts w:ascii="Calibri" w:cs="Calibri" w:eastAsia="Calibri" w:hAnsi="Calibri"/>
+                <w:b/>
+                <w:bCs/>
+                <w:color w:val="2E2A28"/>
+                <w:sz w:val="19"/>
+                <w:szCs w:val="19"/>
+              </w:rPr>
+              <w:t xml:space="preserve">Go-live and daily operations (6 weeks)</w:t>
+            </w:r>
+          </w:p>
+        </w:tc>
+        <w:tc>
+          <w:tcPr>
+            <w:tcW w:type="dxa" w:w="2600"/>
+            <w:shd w:fill="F3EEE6" w:color="auto" w:val="clear"/>
+            <w:tcMar>
+              <w:top w:type="dxa" w:w="70"/>
+              <w:left w:type="dxa" w:w="110"/>
+              <w:bottom w:type="dxa" w:w="70"/>
+              <w:right w:type="dxa" w:w="110"/>
+            </w:tcMar>
+            <w:vAlign w:val="center"/>
+          </w:tcPr>
+          <w:p>
+            <w:pPr>
+              <w:spacing w:after="0"/>
+            </w:pPr>
+            <w:r>
+              <w:rPr>
+                <w:rFonts w:ascii="Calibri" w:cs="Calibri" w:eastAsia="Calibri" w:hAnsi="Calibri"/>
+                <w:b w:val="false"/>
+                <w:bCs w:val="false"/>
+                <w:color w:val="2E2A28"/>
+                <w:sz w:val="19"/>
+                <w:szCs w:val="19"/>
+              </w:rPr>
+              <w:t xml:space="preserve">T to T plus 6 weeks</w:t>
+            </w:r>
+          </w:p>
+        </w:tc>
+        <w:tc>
+          <w:tcPr>
+            <w:tcW w:type="dxa" w:w="1820"/>
+            <w:shd w:fill="F3EEE6" w:color="auto" w:val="clear"/>
+            <w:tcMar>
+              <w:top w:type="dxa" w:w="70"/>
+              <w:left w:type="dxa" w:w="110"/>
+              <w:bottom w:type="dxa" w:w="70"/>
+              <w:right w:type="dxa" w:w="110"/>
+            </w:tcMar>
+            <w:vAlign w:val="center"/>
+          </w:tcPr>
+          <w:p>
+            <w:pPr>
+              <w:spacing w:after="0"/>
+            </w:pPr>
+            <w:r>
+              <w:rPr>
+                <w:rFonts w:ascii="Calibri" w:cs="Calibri" w:eastAsia="Calibri" w:hAnsi="Calibri"/>
+                <w:b w:val="false"/>
+                <w:bCs w:val="false"/>
+                <w:color w:val="2E2A28"/>
+                <w:sz w:val="19"/>
+                <w:szCs w:val="19"/>
+              </w:rPr>
+              <w:t xml:space="preserve">ProMarcom</w:t>
+            </w:r>
+          </w:p>
+        </w:tc>
+      </w:tr>
+      <w:tr>
+        <w:tc>
+          <w:tcPr>
+            <w:tcW w:type="dxa" w:w="4600"/>
+            <w:shd w:fill="FFFFFF" w:color="auto" w:val="clear"/>
+            <w:tcMar>
+              <w:top w:type="dxa" w:w="70"/>
+              <w:left w:type="dxa" w:w="110"/>
+              <w:bottom w:type="dxa" w:w="70"/>
+              <w:right w:type="dxa" w:w="110"/>
+            </w:tcMar>
+            <w:vAlign w:val="center"/>
+          </w:tcPr>
+          <w:p>
+            <w:pPr>
+              <w:spacing w:after="0"/>
+            </w:pPr>
+            <w:r>
+              <w:rPr>
+                <w:rFonts w:ascii="Calibri" w:cs="Calibri" w:eastAsia="Calibri" w:hAnsi="Calibri"/>
+                <w:b/>
+                <w:bCs/>
+                <w:color w:val="2E2A28"/>
+                <w:sz w:val="19"/>
+                <w:szCs w:val="19"/>
+              </w:rPr>
+              <w:t xml:space="preserve">Dismantle, fixture and unsold-stock return</w:t>
+            </w:r>
+          </w:p>
+        </w:tc>
+        <w:tc>
+          <w:tcPr>
+            <w:tcW w:type="dxa" w:w="2600"/>
+            <w:shd w:fill="FFFFFF" w:color="auto" w:val="clear"/>
+            <w:tcMar>
+              <w:top w:type="dxa" w:w="70"/>
+              <w:left w:type="dxa" w:w="110"/>
+              <w:bottom w:type="dxa" w:w="70"/>
+              <w:right w:type="dxa" w:w="110"/>
+            </w:tcMar>
+            <w:vAlign w:val="center"/>
+          </w:tcPr>
+          <w:p>
+            <w:pPr>
+              <w:spacing w:after="0"/>
+            </w:pPr>
+            <w:r>
+              <w:rPr>
+                <w:rFonts w:ascii="Calibri" w:cs="Calibri" w:eastAsia="Calibri" w:hAnsi="Calibri"/>
+                <w:b w:val="false"/>
+                <w:bCs w:val="false"/>
+                <w:color w:val="2E2A28"/>
+                <w:sz w:val="19"/>
+                <w:szCs w:val="19"/>
+              </w:rPr>
+              <w:t xml:space="preserve">T plus 6 to 7 weeks</w:t>
+            </w:r>
+          </w:p>
+        </w:tc>
+        <w:tc>
+          <w:tcPr>
+            <w:tcW w:type="dxa" w:w="1820"/>
+            <w:shd w:fill="FFFFFF" w:color="auto" w:val="clear"/>
+            <w:tcMar>
+              <w:top w:type="dxa" w:w="70"/>
+              <w:left w:type="dxa" w:w="110"/>
+              <w:bottom w:type="dxa" w:w="70"/>
+              <w:right w:type="dxa" w:w="110"/>
+            </w:tcMar>
+            <w:vAlign w:val="center"/>
+          </w:tcPr>
+          <w:p>
+            <w:pPr>
+              <w:spacing w:after="0"/>
+            </w:pPr>
+            <w:r>
+              <w:rPr>
+                <w:rFonts w:ascii="Calibri" w:cs="Calibri" w:eastAsia="Calibri" w:hAnsi="Calibri"/>
+                <w:b w:val="false"/>
+                <w:bCs w:val="false"/>
+                <w:color w:val="2E2A28"/>
+                <w:sz w:val="19"/>
+                <w:szCs w:val="19"/>
+              </w:rPr>
+              <w:t xml:space="preserve">ProMarcom</w:t>
+            </w:r>
+          </w:p>
+        </w:tc>
+      </w:tr>
+      <w:tr>
+        <w:tc>
+          <w:tcPr>
+            <w:tcW w:type="dxa" w:w="4600"/>
+            <w:shd w:fill="F3EEE6" w:color="auto" w:val="clear"/>
+            <w:tcMar>
+              <w:top w:type="dxa" w:w="70"/>
+              <w:left w:type="dxa" w:w="110"/>
+              <w:bottom w:type="dxa" w:w="70"/>
+              <w:right w:type="dxa" w:w="110"/>
+            </w:tcMar>
+            <w:vAlign w:val="center"/>
+          </w:tcPr>
+          <w:p>
+            <w:pPr>
+              <w:spacing w:after="0"/>
+            </w:pPr>
+            <w:r>
+              <w:rPr>
+                <w:rFonts w:ascii="Calibri" w:cs="Calibri" w:eastAsia="Calibri" w:hAnsi="Calibri"/>
+                <w:b/>
+                <w:bCs/>
+                <w:color w:val="2E2A28"/>
+                <w:sz w:val="19"/>
+                <w:szCs w:val="19"/>
+              </w:rPr>
+              <w:t xml:space="preserve">Final reconciliation and season review</w:t>
+            </w:r>
+          </w:p>
+        </w:tc>
+        <w:tc>
+          <w:tcPr>
+            <w:tcW w:type="dxa" w:w="2600"/>
+            <w:shd w:fill="F3EEE6" w:color="auto" w:val="clear"/>
+            <w:tcMar>
+              <w:top w:type="dxa" w:w="70"/>
+              <w:left w:type="dxa" w:w="110"/>
+              <w:bottom w:type="dxa" w:w="70"/>
+              <w:right w:type="dxa" w:w="110"/>
+            </w:tcMar>
+            <w:vAlign w:val="center"/>
+          </w:tcPr>
+          <w:p>
+            <w:pPr>
+              <w:spacing w:after="0"/>
+            </w:pPr>
+            <w:r>
+              <w:rPr>
+                <w:rFonts w:ascii="Calibri" w:cs="Calibri" w:eastAsia="Calibri" w:hAnsi="Calibri"/>
+                <w:b w:val="false"/>
+                <w:bCs w:val="false"/>
+                <w:color w:val="2E2A28"/>
+                <w:sz w:val="19"/>
+                <w:szCs w:val="19"/>
+              </w:rPr>
+              <w:t xml:space="preserve">T plus 7 weeks</w:t>
+            </w:r>
+          </w:p>
+        </w:tc>
+        <w:tc>
+          <w:tcPr>
+            <w:tcW w:type="dxa" w:w="1820"/>
+            <w:shd w:fill="F3EEE6" w:color="auto" w:val="clear"/>
+            <w:tcMar>
+              <w:top w:type="dxa" w:w="70"/>
+              <w:left w:type="dxa" w:w="110"/>
+              <w:bottom w:type="dxa" w:w="70"/>
+              <w:right w:type="dxa" w:w="110"/>
+            </w:tcMar>
+            <w:vAlign w:val="center"/>
+          </w:tcPr>
+          <w:p>
+            <w:pPr>
+              <w:spacing w:after="0"/>
+            </w:pPr>
+            <w:r>
+              <w:rPr>
+                <w:rFonts w:ascii="Calibri" w:cs="Calibri" w:eastAsia="Calibri" w:hAnsi="Calibri"/>
+                <w:b w:val="false"/>
+                <w:bCs w:val="false"/>
+                <w:color w:val="2E2A28"/>
+                <w:sz w:val="19"/>
+                <w:szCs w:val="19"/>
+              </w:rPr>
+              <w:t xml:space="preserve">Doft + ProMarcom</w:t>
+            </w:r>
+          </w:p>
+        </w:tc>
+      </w:tr>
+    </w:tbl>
+    <w:p>
+      <w:pPr>
+        <w:spacing w:after="120"/>
+      </w:pPr>
+      <w:r>
+        <w:rPr>
+          <w:rFonts w:ascii="Calibri" w:cs="Calibri" w:eastAsia="Calibri" w:hAnsi="Calibri"/>
+          <w:i/>
+          <w:iCs/>
+          <w:color w:val="6B625C"/>
+          <w:sz w:val="19"/>
+          <w:szCs w:val="19"/>
+        </w:rPr>
+        <w:t xml:space="preserve">A live project timeline and per-city Gantt are maintained in the operations workbook and shared with your team.</w:t>
+      </w:r>
+    </w:p>
+    <w:p>
+      <w:pPr>
+        <w:pBdr>
+          <w:bottom w:val="single" w:color="C39A98" w:sz="8" w:space="4"/>
+        </w:pBdr>
+        <w:spacing w:after="120" w:before="300"/>
+      </w:pPr>
+      <w:r>
+        <w:rPr>
+          <w:rFonts w:ascii="Cambria" w:cs="Cambria" w:eastAsia="Cambria" w:hAnsi="Cambria"/>
+          <w:b/>
+          <w:bCs/>
+          <w:color w:val="4A343A"/>
+          <w:sz w:val="27"/>
+          <w:szCs w:val="27"/>
+        </w:rPr>
+        <w:t xml:space="preserve">7.  Reporting &amp; Reviews</w:t>
       </w:r>
     </w:p>
     <w:p>
@@ -4071,7 +5019,7 @@
           <w:sz w:val="27"/>
           <w:szCs w:val="27"/>
         </w:rPr>
-        <w:t xml:space="preserve">7.  Our Commitments</w:t>
+        <w:t xml:space="preserve">8.  Our Commitments</w:t>
       </w:r>
     </w:p>
     <w:p>
@@ -4185,7 +5133,7 @@
           <w:sz w:val="27"/>
           <w:szCs w:val="27"/>
         </w:rPr>
-        <w:t xml:space="preserve">8.  What You Provide, and a Few Assumptions</w:t>
+        <w:t xml:space="preserve">9.  What You Provide, and a Few Assumptions</w:t>
       </w:r>
     </w:p>
     <w:p>
@@ -4280,7 +5228,7 @@
           <w:sz w:val="27"/>
           <w:szCs w:val="27"/>
         </w:rPr>
-        <w:t xml:space="preserve">9.  Next Steps</w:t>
+        <w:t xml:space="preserve">10.  Next Steps</w:t>
       </w:r>
     </w:p>
     <w:p>

</xml_diff>

<commit_message>
Remove phased rollout; all locations launch in the same window
- City footprint no longer framed as Phase 1/Phase 2; grouped by metro/sub-metro only
- State all locations go live together; update timeline note and next steps
- Rename timeline column header to Activity

Co-Authored-By: Claude Opus 4.8 <noreply@anthropic.com>
Claude-Session: https://claude.ai/code/session_01SPjFYHW1nTDVr5tUuToRXR
</commit_message>
<xml_diff>
--- a/doft_diwali_popup/Doft_Understanding_and_Key_Deliverables.docx
+++ b/doft_diwali_popup/Doft_Understanding_and_Key_Deliverables.docx
@@ -874,7 +874,7 @@
           <w:sz w:val="21"/>
           <w:szCs w:val="21"/>
         </w:rPr>
-        <w:t xml:space="preserve">We suggest starting in the metros, where premium mall footfall and festive spending are highest, and then adding the stronger sub-metros. Running it in two phases lets you settle the format in the metros first and widen the reach afterwards, either later in the same season or in the following years.</w:t>
+        <w:t xml:space="preserve">All locations go live within the same window. The list below sets out the cities we recommend, grouped by metro and sub-metro. The metros carry the highest premium mall footfall and festive spending, and the sub-metros listed have grown into strong premium retail markets.</w:t>
       </w:r>
     </w:p>
     <w:p>
@@ -890,7 +890,7 @@
           <w:sz w:val="23"/>
           <w:szCs w:val="23"/>
         </w:rPr>
-        <w:t xml:space="preserve">Phase 1: Metro cities (launch first)</w:t>
+        <w:t xml:space="preserve">Metro cities</w:t>
       </w:r>
     </w:p>
     <w:tbl>
@@ -1627,7 +1627,7 @@
           <w:sz w:val="23"/>
           <w:szCs w:val="23"/>
         </w:rPr>
-        <w:t xml:space="preserve">Phase 2: Sub-metro cities (next wave)</w:t>
+        <w:t xml:space="preserve">Sub-metro cities</w:t>
       </w:r>
     </w:p>
     <w:tbl>
@@ -2364,7 +2364,7 @@
           <w:sz w:val="19"/>
           <w:szCs w:val="19"/>
         </w:rPr>
-        <w:t xml:space="preserve">These mall names are only indicative. We will confirm the final list against live availability, footfall, category fit and licence cost. Our advice is to lock the metros first, since premium Diwali slots fill up early.</w:t>
+        <w:t xml:space="preserve">These mall names are only indicative. We will confirm the final list against live availability, footfall, category fit and licence cost. We advise confirming the city list early, since premium Diwali slots fill up quickly.</w:t>
       </w:r>
     </w:p>
     <w:p>
@@ -3943,7 +3943,7 @@
           <w:sz w:val="21"/>
           <w:szCs w:val="21"/>
         </w:rPr>
-        <w:t xml:space="preserve">The plan below is shown relative to each city's go-live (T), with a six-week trading window. Metros launch first, and sub-metros follow either later in the same season or the next, so exact calendar dates are fixed per city once malls are confirmed.</w:t>
+        <w:t xml:space="preserve">The plan below is shown relative to go-live (T), with a six-week trading window. All locations launch together in the same window, so the same plan applies to every city in parallel. Exact calendar dates are fixed once malls are confirmed.</w:t>
       </w:r>
     </w:p>
     <w:tbl>
@@ -3986,7 +3986,7 @@
                 <w:sz w:val="19"/>
                 <w:szCs w:val="19"/>
               </w:rPr>
-              <w:t xml:space="preserve">Phase / Activity</w:t>
+              <w:t xml:space="preserve">Activity</w:t>
             </w:r>
           </w:p>
         </w:tc>
@@ -5247,7 +5247,7 @@
           <w:sz w:val="21"/>
           <w:szCs w:val="21"/>
         </w:rPr>
-        <w:t xml:space="preserve">You confirm the Phase 1 metro cities, so we can lock premium mall slots early.</w:t>
+        <w:t xml:space="preserve">You confirm the final city list, so we can lock premium mall slots early.</w:t>
       </w:r>
     </w:p>
     <w:p>

</xml_diff>

<commit_message>
Apply client revisions to Understanding doc
- Kiosk design moved into ProMarcom scope
- Replace POS/EDC with 'billing hardware and software (to be discussed)'
- Operating window: 6 weeks, with select cities continuing through Christmas/New Year
- Storage held within the kiosk
- New suggested team: 5 sales execs (2 billing), 2 helpers, 1 supervisor, city manager (>2 kiosks/city)
- Scope adds cash management and mall space negotiations
- Cities: drop Select Citywalk & Emporio, add DLF Avenue & Ambience Gurgaon; add Visakhapatnam

Co-Authored-By: Claude Opus 4.8 <noreply@anthropic.com>
Claude-Session: https://claude.ai/code/session_01SPjFYHW1nTDVr5tUuToRXR
</commit_message>
<xml_diff>
--- a/doft_diwali_popup/Doft_Understanding_and_Key_Deliverables.docx
+++ b/doft_diwali_popup/Doft_Understanding_and_Key_Deliverables.docx
@@ -154,7 +154,7 @@
           <w:sz w:val="21"/>
           <w:szCs w:val="21"/>
         </w:rPr>
-        <w:t xml:space="preserve">Doft runs premium home-fragrance kiosks in leading malls through the Diwali season. For 2026, and with the plan to carry on in 2027 and 2028, you will run compact 8x8 ft kiosks in busy malls across the metros and sub-metros, trading for six weeks around Diwali. We handle everything on the ground, from hiring and deployment to the day-to-day running. You supply the stock, the kiosk design, the POS/EDC machines and the uniforms.</w:t>
+        <w:t xml:space="preserve">Doft runs premium home-fragrance kiosks in leading malls through the Diwali season. For 2026, and with the plan to carry on in 2027 and 2028, you will run compact 8x8 ft kiosks in busy malls across the metros and sub-metros, trading for six weeks around Diwali, with a few cities continuing through Christmas and New Year. We handle everything on the ground, from the kiosk design and build to hiring, deployment and the day-to-day running. You supply the stock, the furniture and the uniforms. Billing hardware and software is still to be discussed.</w:t>
       </w:r>
     </w:p>
     <w:p>
@@ -358,7 +358,7 @@
                 <w:sz w:val="19"/>
                 <w:szCs w:val="19"/>
               </w:rPr>
-              <w:t xml:space="preserve">Six weeks of live trading per city, across the Diwali season</w:t>
+              <w:t xml:space="preserve">Six weeks of live trading per city across the Diwali season. A few cities may continue through Christmas and New Year.</w:t>
             </w:r>
           </w:p>
         </w:tc>
@@ -418,7 +418,7 @@
                 <w:sz w:val="19"/>
                 <w:szCs w:val="19"/>
               </w:rPr>
-              <w:t xml:space="preserve">8x8 ft (about 64 sq ft), built to your approved design</w:t>
+              <w:t xml:space="preserve">8x8 ft (about 64 sq ft), designed, built and installed by ProMarcom</w:t>
             </w:r>
           </w:p>
         </w:tc>
@@ -478,7 +478,7 @@
                 <w:sz w:val="19"/>
                 <w:szCs w:val="19"/>
               </w:rPr>
-              <w:t xml:space="preserve">About 40 sq ft of secure storage for replenishment, or mall-provided</w:t>
+              <w:t xml:space="preserve">About 40 sq ft of secure replenishment storage, held within the kiosk</w:t>
             </w:r>
           </w:p>
         </w:tc>
@@ -658,7 +658,7 @@
                 <w:sz w:val="19"/>
                 <w:szCs w:val="19"/>
               </w:rPr>
-              <w:t xml:space="preserve">Full team of 12 per kiosk (see Section 5)</w:t>
+              <w:t xml:space="preserve">8 per kiosk, plus a city manager where needed (see Section 5)</w:t>
             </w:r>
           </w:p>
         </w:tc>
@@ -749,7 +749,7 @@
                 <w:sz w:val="19"/>
                 <w:szCs w:val="19"/>
               </w:rPr>
-              <w:t xml:space="preserve">You supply</w:t>
+              <w:t xml:space="preserve">Billing hardware &amp; software</w:t>
             </w:r>
           </w:p>
         </w:tc>
@@ -778,7 +778,7 @@
                 <w:sz w:val="19"/>
                 <w:szCs w:val="19"/>
               </w:rPr>
-              <w:t xml:space="preserve">Stock, kiosk design and kit, furniture, POS/EDC, uniforms (returnable)</w:t>
+              <w:t xml:space="preserve">To be discussed and agreed</w:t>
             </w:r>
           </w:p>
         </w:tc>
@@ -809,6 +809,66 @@
                 <w:sz w:val="19"/>
                 <w:szCs w:val="19"/>
               </w:rPr>
+              <w:t xml:space="preserve">You supply</w:t>
+            </w:r>
+          </w:p>
+        </w:tc>
+        <w:tc>
+          <w:tcPr>
+            <w:tcW w:type="dxa" w:w="6020"/>
+            <w:shd w:fill="FFFFFF" w:color="auto" w:val="clear"/>
+            <w:tcMar>
+              <w:top w:type="dxa" w:w="70"/>
+              <w:left w:type="dxa" w:w="110"/>
+              <w:bottom w:type="dxa" w:w="70"/>
+              <w:right w:type="dxa" w:w="110"/>
+            </w:tcMar>
+            <w:vAlign w:val="center"/>
+          </w:tcPr>
+          <w:p>
+            <w:pPr>
+              <w:spacing w:after="0"/>
+            </w:pPr>
+            <w:r>
+              <w:rPr>
+                <w:rFonts w:ascii="Calibri" w:cs="Calibri" w:eastAsia="Calibri" w:hAnsi="Calibri"/>
+                <w:b w:val="false"/>
+                <w:bCs w:val="false"/>
+                <w:color w:val="2E2A28"/>
+                <w:sz w:val="19"/>
+                <w:szCs w:val="19"/>
+              </w:rPr>
+              <w:t xml:space="preserve">Stock, furniture and uniforms (returnable)</w:t>
+            </w:r>
+          </w:p>
+        </w:tc>
+      </w:tr>
+      <w:tr>
+        <w:tc>
+          <w:tcPr>
+            <w:tcW w:type="dxa" w:w="3000"/>
+            <w:shd w:fill="F3EEE6" w:color="auto" w:val="clear"/>
+            <w:tcMar>
+              <w:top w:type="dxa" w:w="70"/>
+              <w:left w:type="dxa" w:w="110"/>
+              <w:bottom w:type="dxa" w:w="70"/>
+              <w:right w:type="dxa" w:w="110"/>
+            </w:tcMar>
+            <w:vAlign w:val="center"/>
+          </w:tcPr>
+          <w:p>
+            <w:pPr>
+              <w:spacing w:after="0"/>
+            </w:pPr>
+            <w:r>
+              <w:rPr>
+                <w:rFonts w:ascii="Calibri" w:cs="Calibri" w:eastAsia="Calibri" w:hAnsi="Calibri"/>
+                <w:b/>
+                <w:bCs/>
+                <w:color w:val="2E2A28"/>
+                <w:sz w:val="19"/>
+                <w:szCs w:val="19"/>
+              </w:rPr>
               <w:t xml:space="preserve">We handle</w:t>
             </w:r>
           </w:p>
@@ -816,29 +876,29 @@
         <w:tc>
           <w:tcPr>
             <w:tcW w:type="dxa" w:w="6020"/>
-            <w:shd w:fill="FFFFFF" w:color="auto" w:val="clear"/>
-            <w:tcMar>
-              <w:top w:type="dxa" w:w="70"/>
-              <w:left w:type="dxa" w:w="110"/>
-              <w:bottom w:type="dxa" w:w="70"/>
-              <w:right w:type="dxa" w:w="110"/>
-            </w:tcMar>
-            <w:vAlign w:val="center"/>
-          </w:tcPr>
-          <w:p>
-            <w:pPr>
-              <w:spacing w:after="0"/>
-            </w:pPr>
-            <w:r>
-              <w:rPr>
-                <w:rFonts w:ascii="Calibri" w:cs="Calibri" w:eastAsia="Calibri" w:hAnsi="Calibri"/>
-                <w:b w:val="false"/>
-                <w:bCs w:val="false"/>
-                <w:color w:val="2E2A28"/>
-                <w:sz w:val="19"/>
-                <w:szCs w:val="19"/>
-              </w:rPr>
-              <w:t xml:space="preserve">Kiosk build and install, manpower, logistics, licences, daily operations and reporting</w:t>
+            <w:shd w:fill="F3EEE6" w:color="auto" w:val="clear"/>
+            <w:tcMar>
+              <w:top w:type="dxa" w:w="70"/>
+              <w:left w:type="dxa" w:w="110"/>
+              <w:bottom w:type="dxa" w:w="70"/>
+              <w:right w:type="dxa" w:w="110"/>
+            </w:tcMar>
+            <w:vAlign w:val="center"/>
+          </w:tcPr>
+          <w:p>
+            <w:pPr>
+              <w:spacing w:after="0"/>
+            </w:pPr>
+            <w:r>
+              <w:rPr>
+                <w:rFonts w:ascii="Calibri" w:cs="Calibri" w:eastAsia="Calibri" w:hAnsi="Calibri"/>
+                <w:b w:val="false"/>
+                <w:bCs w:val="false"/>
+                <w:color w:val="2E2A28"/>
+                <w:sz w:val="19"/>
+                <w:szCs w:val="19"/>
+              </w:rPr>
+              <w:t xml:space="preserve">Kiosk design, build and install, manpower, logistics, licences, daily operations, reporting, cash management and mall space negotiations</w:t>
             </w:r>
           </w:p>
         </w:tc>
@@ -1045,7 +1105,7 @@
                 <w:sz w:val="19"/>
                 <w:szCs w:val="19"/>
               </w:rPr>
-              <w:t xml:space="preserve">Select Citywalk, DLF Promenade/Emporio, Ambience</w:t>
+              <w:t xml:space="preserve">DLF Promenade, DLF Avenue, Ambience Gurgaon</w:t>
             </w:r>
           </w:p>
         </w:tc>
@@ -2350,6 +2410,95 @@
           </w:p>
         </w:tc>
       </w:tr>
+      <w:tr>
+        <w:tc>
+          <w:tcPr>
+            <w:tcW w:type="dxa" w:w="1700"/>
+            <w:shd w:fill="FFFFFF" w:color="auto" w:val="clear"/>
+            <w:tcMar>
+              <w:top w:type="dxa" w:w="70"/>
+              <w:left w:type="dxa" w:w="110"/>
+              <w:bottom w:type="dxa" w:w="70"/>
+              <w:right w:type="dxa" w:w="110"/>
+            </w:tcMar>
+            <w:vAlign w:val="center"/>
+          </w:tcPr>
+          <w:p>
+            <w:pPr>
+              <w:spacing w:after="0"/>
+            </w:pPr>
+            <w:r>
+              <w:rPr>
+                <w:rFonts w:ascii="Calibri" w:cs="Calibri" w:eastAsia="Calibri" w:hAnsi="Calibri"/>
+                <w:b/>
+                <w:bCs/>
+                <w:color w:val="2E2A28"/>
+                <w:sz w:val="19"/>
+                <w:szCs w:val="19"/>
+              </w:rPr>
+              <w:t xml:space="preserve">Visakhapatnam</w:t>
+            </w:r>
+          </w:p>
+        </w:tc>
+        <w:tc>
+          <w:tcPr>
+            <w:tcW w:type="dxa" w:w="4620"/>
+            <w:shd w:fill="FFFFFF" w:color="auto" w:val="clear"/>
+            <w:tcMar>
+              <w:top w:type="dxa" w:w="70"/>
+              <w:left w:type="dxa" w:w="110"/>
+              <w:bottom w:type="dxa" w:w="70"/>
+              <w:right w:type="dxa" w:w="110"/>
+            </w:tcMar>
+            <w:vAlign w:val="center"/>
+          </w:tcPr>
+          <w:p>
+            <w:pPr>
+              <w:spacing w:after="0"/>
+            </w:pPr>
+            <w:r>
+              <w:rPr>
+                <w:rFonts w:ascii="Calibri" w:cs="Calibri" w:eastAsia="Calibri" w:hAnsi="Calibri"/>
+                <w:b w:val="false"/>
+                <w:bCs w:val="false"/>
+                <w:color w:val="2E2A28"/>
+                <w:sz w:val="19"/>
+                <w:szCs w:val="19"/>
+              </w:rPr>
+              <w:t xml:space="preserve">CMR Central, Vizag Central</w:t>
+            </w:r>
+          </w:p>
+        </w:tc>
+        <w:tc>
+          <w:tcPr>
+            <w:tcW w:type="dxa" w:w="2700"/>
+            <w:shd w:fill="FFFFFF" w:color="auto" w:val="clear"/>
+            <w:tcMar>
+              <w:top w:type="dxa" w:w="70"/>
+              <w:left w:type="dxa" w:w="110"/>
+              <w:bottom w:type="dxa" w:w="70"/>
+              <w:right w:type="dxa" w:w="110"/>
+            </w:tcMar>
+            <w:vAlign w:val="center"/>
+          </w:tcPr>
+          <w:p>
+            <w:pPr>
+              <w:spacing w:after="0"/>
+            </w:pPr>
+            <w:r>
+              <w:rPr>
+                <w:rFonts w:ascii="Calibri" w:cs="Calibri" w:eastAsia="Calibri" w:hAnsi="Calibri"/>
+                <w:b w:val="false"/>
+                <w:bCs w:val="false"/>
+                <w:color w:val="2E2A28"/>
+                <w:sz w:val="19"/>
+                <w:szCs w:val="19"/>
+              </w:rPr>
+              <w:t xml:space="preserve">Growing coastal premium market</w:t>
+            </w:r>
+          </w:p>
+        </w:tc>
+      </w:tr>
     </w:tbl>
     <w:p>
       <w:pPr>
@@ -2496,7 +2645,7 @@
                 <w:sz w:val="19"/>
                 <w:szCs w:val="19"/>
               </w:rPr>
-              <w:t xml:space="preserve">1. Kiosk build &amp; install</w:t>
+              <w:t xml:space="preserve">1. Kiosk design, build &amp; install</w:t>
             </w:r>
           </w:p>
         </w:tc>
@@ -2528,7 +2677,7 @@
                 <w:sz w:val="18"/>
                 <w:szCs w:val="18"/>
               </w:rPr>
-              <w:t xml:space="preserve">Build and install the 8x8 kiosk to your approved design</w:t>
+              <w:t xml:space="preserve">Design, build and install the 8x8 kiosk to an agreed look</w:t>
             </w:r>
           </w:p>
           <w:p>
@@ -2597,7 +2746,7 @@
                 <w:sz w:val="19"/>
                 <w:szCs w:val="19"/>
               </w:rPr>
-              <w:t xml:space="preserve">2. Mall coordination &amp; legal</w:t>
+              <w:t xml:space="preserve">2. Mall space, coordination &amp; legal</w:t>
             </w:r>
           </w:p>
         </w:tc>
@@ -2629,7 +2778,7 @@
                 <w:sz w:val="18"/>
                 <w:szCs w:val="18"/>
               </w:rPr>
-              <w:t xml:space="preserve">Liaison with mall management through the season</w:t>
+              <w:t xml:space="preserve">Negotiate mall space and commercial terms</w:t>
             </w:r>
           </w:p>
           <w:p>
@@ -2648,7 +2797,7 @@
                 <w:sz w:val="18"/>
                 <w:szCs w:val="18"/>
               </w:rPr>
-              <w:t xml:space="preserve">All permissions, licences, documents and compliance</w:t>
+              <w:t xml:space="preserve">Liaison with mall management through the season</w:t>
             </w:r>
           </w:p>
           <w:p>
@@ -2667,53 +2816,9 @@
                 <w:sz w:val="18"/>
                 <w:szCs w:val="18"/>
               </w:rPr>
-              <w:t xml:space="preserve">Electricity, access passes, loading/unloading and operational approvals</w:t>
-            </w:r>
-          </w:p>
-        </w:tc>
-      </w:tr>
-      <w:tr>
-        <w:tc>
-          <w:tcPr>
-            <w:tcW w:type="dxa" w:w="2500"/>
-            <w:shd w:fill="FFFFFF" w:color="auto" w:val="clear"/>
-            <w:tcMar>
-              <w:top w:type="dxa" w:w="70"/>
-              <w:left w:type="dxa" w:w="110"/>
-              <w:bottom w:type="dxa" w:w="70"/>
-              <w:right w:type="dxa" w:w="110"/>
-            </w:tcMar>
-            <w:vAlign w:val="center"/>
-          </w:tcPr>
-          <w:p>
-            <w:pPr>
-              <w:spacing w:after="0"/>
-            </w:pPr>
-            <w:r>
-              <w:rPr>
-                <w:rFonts w:ascii="Calibri" w:cs="Calibri" w:eastAsia="Calibri" w:hAnsi="Calibri"/>
-                <w:b/>
-                <w:bCs/>
-                <w:color w:val="2E2A28"/>
-                <w:sz w:val="19"/>
-                <w:szCs w:val="19"/>
-              </w:rPr>
-              <w:t xml:space="preserve">3. Logistics &amp; replenishment</w:t>
-            </w:r>
-          </w:p>
-        </w:tc>
-        <w:tc>
-          <w:tcPr>
-            <w:tcW w:type="dxa" w:w="6520"/>
-            <w:shd w:fill="FFFFFF" w:color="auto" w:val="clear"/>
-            <w:tcMar>
-              <w:top w:type="dxa" w:w="70"/>
-              <w:left w:type="dxa" w:w="110"/>
-              <w:bottom w:type="dxa" w:w="70"/>
-              <w:right w:type="dxa" w:w="110"/>
-            </w:tcMar>
-            <w:vAlign w:val="center"/>
-          </w:tcPr>
+              <w:t xml:space="preserve">All permissions, licences, documents and compliance</w:t>
+            </w:r>
+          </w:p>
           <w:p>
             <w:pPr>
               <w:pStyle w:val="ListParagraph"/>
@@ -2730,9 +2835,53 @@
                 <w:sz w:val="18"/>
                 <w:szCs w:val="18"/>
               </w:rPr>
-              <w:t xml:space="preserve">Pick up and move stock from your Ghaziabad warehouse</w:t>
-            </w:r>
-          </w:p>
+              <w:t xml:space="preserve">Electricity, access passes, loading/unloading and operational approvals</w:t>
+            </w:r>
+          </w:p>
+        </w:tc>
+      </w:tr>
+      <w:tr>
+        <w:tc>
+          <w:tcPr>
+            <w:tcW w:type="dxa" w:w="2500"/>
+            <w:shd w:fill="FFFFFF" w:color="auto" w:val="clear"/>
+            <w:tcMar>
+              <w:top w:type="dxa" w:w="70"/>
+              <w:left w:type="dxa" w:w="110"/>
+              <w:bottom w:type="dxa" w:w="70"/>
+              <w:right w:type="dxa" w:w="110"/>
+            </w:tcMar>
+            <w:vAlign w:val="center"/>
+          </w:tcPr>
+          <w:p>
+            <w:pPr>
+              <w:spacing w:after="0"/>
+            </w:pPr>
+            <w:r>
+              <w:rPr>
+                <w:rFonts w:ascii="Calibri" w:cs="Calibri" w:eastAsia="Calibri" w:hAnsi="Calibri"/>
+                <w:b/>
+                <w:bCs/>
+                <w:color w:val="2E2A28"/>
+                <w:sz w:val="19"/>
+                <w:szCs w:val="19"/>
+              </w:rPr>
+              <w:t xml:space="preserve">3. Logistics &amp; replenishment</w:t>
+            </w:r>
+          </w:p>
+        </w:tc>
+        <w:tc>
+          <w:tcPr>
+            <w:tcW w:type="dxa" w:w="6520"/>
+            <w:shd w:fill="FFFFFF" w:color="auto" w:val="clear"/>
+            <w:tcMar>
+              <w:top w:type="dxa" w:w="70"/>
+              <w:left w:type="dxa" w:w="110"/>
+              <w:bottom w:type="dxa" w:w="70"/>
+              <w:right w:type="dxa" w:w="110"/>
+            </w:tcMar>
+            <w:vAlign w:val="center"/>
+          </w:tcPr>
           <w:p>
             <w:pPr>
               <w:pStyle w:val="ListParagraph"/>
@@ -2749,7 +2898,7 @@
                 <w:sz w:val="18"/>
                 <w:szCs w:val="18"/>
               </w:rPr>
-              <w:t xml:space="preserve">Refill on time from local storage, with reorder levels set per SKU</w:t>
+              <w:t xml:space="preserve">Pick up and move stock from your Ghaziabad warehouse</w:t>
             </w:r>
           </w:p>
           <w:p>
@@ -2768,53 +2917,9 @@
                 <w:sz w:val="18"/>
                 <w:szCs w:val="18"/>
               </w:rPr>
-              <w:t xml:space="preserve">Safe handling, stock control, and return of unsold stock with reconciliation</w:t>
-            </w:r>
-          </w:p>
-        </w:tc>
-      </w:tr>
-      <w:tr>
-        <w:tc>
-          <w:tcPr>
-            <w:tcW w:type="dxa" w:w="2500"/>
-            <w:shd w:fill="F3EEE6" w:color="auto" w:val="clear"/>
-            <w:tcMar>
-              <w:top w:type="dxa" w:w="70"/>
-              <w:left w:type="dxa" w:w="110"/>
-              <w:bottom w:type="dxa" w:w="70"/>
-              <w:right w:type="dxa" w:w="110"/>
-            </w:tcMar>
-            <w:vAlign w:val="center"/>
-          </w:tcPr>
-          <w:p>
-            <w:pPr>
-              <w:spacing w:after="0"/>
-            </w:pPr>
-            <w:r>
-              <w:rPr>
-                <w:rFonts w:ascii="Calibri" w:cs="Calibri" w:eastAsia="Calibri" w:hAnsi="Calibri"/>
-                <w:b/>
-                <w:bCs/>
-                <w:color w:val="2E2A28"/>
-                <w:sz w:val="19"/>
-                <w:szCs w:val="19"/>
-              </w:rPr>
-              <w:t xml:space="preserve">4. Recruitment &amp; staffing</w:t>
-            </w:r>
-          </w:p>
-        </w:tc>
-        <w:tc>
-          <w:tcPr>
-            <w:tcW w:type="dxa" w:w="6520"/>
-            <w:shd w:fill="F3EEE6" w:color="auto" w:val="clear"/>
-            <w:tcMar>
-              <w:top w:type="dxa" w:w="70"/>
-              <w:left w:type="dxa" w:w="110"/>
-              <w:bottom w:type="dxa" w:w="70"/>
-              <w:right w:type="dxa" w:w="110"/>
-            </w:tcMar>
-            <w:vAlign w:val="center"/>
-          </w:tcPr>
+              <w:t xml:space="preserve">Refill on time from local storage, with reorder levels set per SKU</w:t>
+            </w:r>
+          </w:p>
           <w:p>
             <w:pPr>
               <w:pStyle w:val="ListParagraph"/>
@@ -2831,9 +2936,53 @@
                 <w:sz w:val="18"/>
                 <w:szCs w:val="18"/>
               </w:rPr>
-              <w:t xml:space="preserve">Sourcing, background checks, deployment and attendance</w:t>
-            </w:r>
-          </w:p>
+              <w:t xml:space="preserve">Safe handling, stock control, and return of unsold stock with reconciliation</w:t>
+            </w:r>
+          </w:p>
+        </w:tc>
+      </w:tr>
+      <w:tr>
+        <w:tc>
+          <w:tcPr>
+            <w:tcW w:type="dxa" w:w="2500"/>
+            <w:shd w:fill="F3EEE6" w:color="auto" w:val="clear"/>
+            <w:tcMar>
+              <w:top w:type="dxa" w:w="70"/>
+              <w:left w:type="dxa" w:w="110"/>
+              <w:bottom w:type="dxa" w:w="70"/>
+              <w:right w:type="dxa" w:w="110"/>
+            </w:tcMar>
+            <w:vAlign w:val="center"/>
+          </w:tcPr>
+          <w:p>
+            <w:pPr>
+              <w:spacing w:after="0"/>
+            </w:pPr>
+            <w:r>
+              <w:rPr>
+                <w:rFonts w:ascii="Calibri" w:cs="Calibri" w:eastAsia="Calibri" w:hAnsi="Calibri"/>
+                <w:b/>
+                <w:bCs/>
+                <w:color w:val="2E2A28"/>
+                <w:sz w:val="19"/>
+                <w:szCs w:val="19"/>
+              </w:rPr>
+              <w:t xml:space="preserve">4. Recruitment &amp; staffing</w:t>
+            </w:r>
+          </w:p>
+        </w:tc>
+        <w:tc>
+          <w:tcPr>
+            <w:tcW w:type="dxa" w:w="6520"/>
+            <w:shd w:fill="F3EEE6" w:color="auto" w:val="clear"/>
+            <w:tcMar>
+              <w:top w:type="dxa" w:w="70"/>
+              <w:left w:type="dxa" w:w="110"/>
+              <w:bottom w:type="dxa" w:w="70"/>
+              <w:right w:type="dxa" w:w="110"/>
+            </w:tcMar>
+            <w:vAlign w:val="center"/>
+          </w:tcPr>
           <w:p>
             <w:pPr>
               <w:pStyle w:val="ListParagraph"/>
@@ -2850,7 +2999,7 @@
                 <w:sz w:val="18"/>
                 <w:szCs w:val="18"/>
               </w:rPr>
-              <w:t xml:space="preserve">Payroll and full statutory compliance for all staff</w:t>
+              <w:t xml:space="preserve">Sourcing, background checks, deployment and attendance</w:t>
             </w:r>
           </w:p>
           <w:p>
@@ -2869,53 +3018,9 @@
                 <w:sz w:val="18"/>
                 <w:szCs w:val="18"/>
               </w:rPr>
-              <w:t xml:space="preserve">Same-day replacement of any absent or resigned staff, at no extra cost</w:t>
-            </w:r>
-          </w:p>
-        </w:tc>
-      </w:tr>
-      <w:tr>
-        <w:tc>
-          <w:tcPr>
-            <w:tcW w:type="dxa" w:w="2500"/>
-            <w:shd w:fill="FFFFFF" w:color="auto" w:val="clear"/>
-            <w:tcMar>
-              <w:top w:type="dxa" w:w="70"/>
-              <w:left w:type="dxa" w:w="110"/>
-              <w:bottom w:type="dxa" w:w="70"/>
-              <w:right w:type="dxa" w:w="110"/>
-            </w:tcMar>
-            <w:vAlign w:val="center"/>
-          </w:tcPr>
-          <w:p>
-            <w:pPr>
-              <w:spacing w:after="0"/>
-            </w:pPr>
-            <w:r>
-              <w:rPr>
-                <w:rFonts w:ascii="Calibri" w:cs="Calibri" w:eastAsia="Calibri" w:hAnsi="Calibri"/>
-                <w:b/>
-                <w:bCs/>
-                <w:color w:val="2E2A28"/>
-                <w:sz w:val="19"/>
-                <w:szCs w:val="19"/>
-              </w:rPr>
-              <w:t xml:space="preserve">5. Training support</w:t>
-            </w:r>
-          </w:p>
-        </w:tc>
-        <w:tc>
-          <w:tcPr>
-            <w:tcW w:type="dxa" w:w="6520"/>
-            <w:shd w:fill="FFFFFF" w:color="auto" w:val="clear"/>
-            <w:tcMar>
-              <w:top w:type="dxa" w:w="70"/>
-              <w:left w:type="dxa" w:w="110"/>
-              <w:bottom w:type="dxa" w:w="70"/>
-              <w:right w:type="dxa" w:w="110"/>
-            </w:tcMar>
-            <w:vAlign w:val="center"/>
-          </w:tcPr>
+              <w:t xml:space="preserve">Payroll and full statutory compliance for all staff</w:t>
+            </w:r>
+          </w:p>
           <w:p>
             <w:pPr>
               <w:pStyle w:val="ListParagraph"/>
@@ -2932,9 +3037,53 @@
                 <w:sz w:val="18"/>
                 <w:szCs w:val="18"/>
               </w:rPr>
-              <w:t xml:space="preserve">Get full attendance at your one-day product and sales training</w:t>
-            </w:r>
-          </w:p>
+              <w:t xml:space="preserve">Same-day replacement of any absent or resigned staff, at no extra cost</w:t>
+            </w:r>
+          </w:p>
+        </w:tc>
+      </w:tr>
+      <w:tr>
+        <w:tc>
+          <w:tcPr>
+            <w:tcW w:type="dxa" w:w="2500"/>
+            <w:shd w:fill="FFFFFF" w:color="auto" w:val="clear"/>
+            <w:tcMar>
+              <w:top w:type="dxa" w:w="70"/>
+              <w:left w:type="dxa" w:w="110"/>
+              <w:bottom w:type="dxa" w:w="70"/>
+              <w:right w:type="dxa" w:w="110"/>
+            </w:tcMar>
+            <w:vAlign w:val="center"/>
+          </w:tcPr>
+          <w:p>
+            <w:pPr>
+              <w:spacing w:after="0"/>
+            </w:pPr>
+            <w:r>
+              <w:rPr>
+                <w:rFonts w:ascii="Calibri" w:cs="Calibri" w:eastAsia="Calibri" w:hAnsi="Calibri"/>
+                <w:b/>
+                <w:bCs/>
+                <w:color w:val="2E2A28"/>
+                <w:sz w:val="19"/>
+                <w:szCs w:val="19"/>
+              </w:rPr>
+              <w:t xml:space="preserve">5. Training support</w:t>
+            </w:r>
+          </w:p>
+        </w:tc>
+        <w:tc>
+          <w:tcPr>
+            <w:tcW w:type="dxa" w:w="6520"/>
+            <w:shd w:fill="FFFFFF" w:color="auto" w:val="clear"/>
+            <w:tcMar>
+              <w:top w:type="dxa" w:w="70"/>
+              <w:left w:type="dxa" w:w="110"/>
+              <w:bottom w:type="dxa" w:w="70"/>
+              <w:right w:type="dxa" w:w="110"/>
+            </w:tcMar>
+            <w:vAlign w:val="center"/>
+          </w:tcPr>
           <w:p>
             <w:pPr>
               <w:pStyle w:val="ListParagraph"/>
@@ -2951,53 +3100,9 @@
                 <w:sz w:val="18"/>
                 <w:szCs w:val="18"/>
               </w:rPr>
-              <w:t xml:space="preserve">Keep trained staff on through the season, and train any replacements</w:t>
-            </w:r>
-          </w:p>
-        </w:tc>
-      </w:tr>
-      <w:tr>
-        <w:tc>
-          <w:tcPr>
-            <w:tcW w:type="dxa" w:w="2500"/>
-            <w:shd w:fill="F3EEE6" w:color="auto" w:val="clear"/>
-            <w:tcMar>
-              <w:top w:type="dxa" w:w="70"/>
-              <w:left w:type="dxa" w:w="110"/>
-              <w:bottom w:type="dxa" w:w="70"/>
-              <w:right w:type="dxa" w:w="110"/>
-            </w:tcMar>
-            <w:vAlign w:val="center"/>
-          </w:tcPr>
-          <w:p>
-            <w:pPr>
-              <w:spacing w:after="0"/>
-            </w:pPr>
-            <w:r>
-              <w:rPr>
-                <w:rFonts w:ascii="Calibri" w:cs="Calibri" w:eastAsia="Calibri" w:hAnsi="Calibri"/>
-                <w:b/>
-                <w:bCs/>
-                <w:color w:val="2E2A28"/>
-                <w:sz w:val="19"/>
-                <w:szCs w:val="19"/>
-              </w:rPr>
-              <w:t xml:space="preserve">6. Store operations</w:t>
-            </w:r>
-          </w:p>
-        </w:tc>
-        <w:tc>
-          <w:tcPr>
-            <w:tcW w:type="dxa" w:w="6520"/>
-            <w:shd w:fill="F3EEE6" w:color="auto" w:val="clear"/>
-            <w:tcMar>
-              <w:top w:type="dxa" w:w="70"/>
-              <w:left w:type="dxa" w:w="110"/>
-              <w:bottom w:type="dxa" w:w="70"/>
-              <w:right w:type="dxa" w:w="110"/>
-            </w:tcMar>
-            <w:vAlign w:val="center"/>
-          </w:tcPr>
+              <w:t xml:space="preserve">Get full attendance at your one-day product and sales training</w:t>
+            </w:r>
+          </w:p>
           <w:p>
             <w:pPr>
               <w:pStyle w:val="ListParagraph"/>
@@ -3014,9 +3119,53 @@
                 <w:sz w:val="18"/>
                 <w:szCs w:val="18"/>
               </w:rPr>
-              <w:t xml:space="preserve">Daily open and close, sales and customer service</w:t>
-            </w:r>
-          </w:p>
+              <w:t xml:space="preserve">Keep trained staff on through the season, and train any replacements</w:t>
+            </w:r>
+          </w:p>
+        </w:tc>
+      </w:tr>
+      <w:tr>
+        <w:tc>
+          <w:tcPr>
+            <w:tcW w:type="dxa" w:w="2500"/>
+            <w:shd w:fill="F3EEE6" w:color="auto" w:val="clear"/>
+            <w:tcMar>
+              <w:top w:type="dxa" w:w="70"/>
+              <w:left w:type="dxa" w:w="110"/>
+              <w:bottom w:type="dxa" w:w="70"/>
+              <w:right w:type="dxa" w:w="110"/>
+            </w:tcMar>
+            <w:vAlign w:val="center"/>
+          </w:tcPr>
+          <w:p>
+            <w:pPr>
+              <w:spacing w:after="0"/>
+            </w:pPr>
+            <w:r>
+              <w:rPr>
+                <w:rFonts w:ascii="Calibri" w:cs="Calibri" w:eastAsia="Calibri" w:hAnsi="Calibri"/>
+                <w:b/>
+                <w:bCs/>
+                <w:color w:val="2E2A28"/>
+                <w:sz w:val="19"/>
+                <w:szCs w:val="19"/>
+              </w:rPr>
+              <w:t xml:space="preserve">6. Store operations &amp; cash</w:t>
+            </w:r>
+          </w:p>
+        </w:tc>
+        <w:tc>
+          <w:tcPr>
+            <w:tcW w:type="dxa" w:w="6520"/>
+            <w:shd w:fill="F3EEE6" w:color="auto" w:val="clear"/>
+            <w:tcMar>
+              <w:top w:type="dxa" w:w="70"/>
+              <w:left w:type="dxa" w:w="110"/>
+              <w:bottom w:type="dxa" w:w="70"/>
+              <w:right w:type="dxa" w:w="110"/>
+            </w:tcMar>
+            <w:vAlign w:val="center"/>
+          </w:tcPr>
           <w:p>
             <w:pPr>
               <w:pStyle w:val="ListParagraph"/>
@@ -3033,7 +3182,7 @@
                 <w:sz w:val="18"/>
                 <w:szCs w:val="18"/>
               </w:rPr>
-              <w:t xml:space="preserve">Cash handling and POS/EDC, plus visual merchandising and cleanliness</w:t>
+              <w:t xml:space="preserve">Daily open and close, sales and customer service</w:t>
             </w:r>
           </w:p>
           <w:p>
@@ -3052,7 +3201,26 @@
                 <w:sz w:val="18"/>
                 <w:szCs w:val="18"/>
               </w:rPr>
-              <w:t xml:space="preserve">Stock reconciliation, and compliance with mall and Doft standards</w:t>
+              <w:t xml:space="preserve">Billing, cash handling, daily deposits and reconciliation</w:t>
+            </w:r>
+          </w:p>
+          <w:p>
+            <w:pPr>
+              <w:pStyle w:val="ListParagraph"/>
+              <w:numPr>
+                <w:ilvl w:val="0"/>
+                <w:numId w:val="2"/>
+              </w:numPr>
+              <w:spacing w:after="30"/>
+            </w:pPr>
+            <w:r>
+              <w:rPr>
+                <w:rFonts w:ascii="Calibri" w:cs="Calibri" w:eastAsia="Calibri" w:hAnsi="Calibri"/>
+                <w:color w:val="2E2A28"/>
+                <w:sz w:val="18"/>
+                <w:szCs w:val="18"/>
+              </w:rPr>
+              <w:t xml:space="preserve">Visual merchandising, cleanliness, and compliance with mall and Doft standards</w:t>
             </w:r>
           </w:p>
         </w:tc>
@@ -3189,7 +3357,7 @@
           <w:sz w:val="21"/>
           <w:szCs w:val="21"/>
         </w:rPr>
-        <w:t xml:space="preserve">We will deploy the full team specified in the brief at every kiosk: twelve people covering sales, support, cash handling, housekeeping and transport, led by a Team Leader who is a permanent ProMarcom employee. Alongside this, we will hold a trained bench of about 15% per city, so any absence is covered the same day at no extra cost to you.</w:t>
+        <w:t xml:space="preserve">We suggest the team below at each kiosk. Two of the five sales executives also handle billing, so the counter stays covered through the day. A City Manager oversees any city that runs more than two kiosks at the same time. Alongside this, we keep a trained bench of about 15% per city, so any absence is covered the same day at no extra cost to you.</w:t>
       </w:r>
     </w:p>
     <w:tbl>
@@ -3258,7 +3426,7 @@
                 <w:sz w:val="19"/>
                 <w:szCs w:val="19"/>
               </w:rPr>
-              <w:t xml:space="preserve">Per kiosk</w:t>
+              <w:t xml:space="preserve">Count</w:t>
             </w:r>
           </w:p>
         </w:tc>
@@ -3344,7 +3512,7 @@
                 <w:sz w:val="19"/>
                 <w:szCs w:val="19"/>
               </w:rPr>
-              <w:t xml:space="preserve">6</w:t>
+              <w:t xml:space="preserve">5</w:t>
             </w:r>
           </w:p>
         </w:tc>
@@ -3373,7 +3541,7 @@
                 <w:sz w:val="19"/>
                 <w:szCs w:val="19"/>
               </w:rPr>
-              <w:t xml:space="preserve">Female, 22-25, fluent English, retail sales experience</w:t>
+              <w:t xml:space="preserve">Two also handle billing. Female, 22-25, fluent English, retail sales experience</w:t>
             </w:r>
           </w:p>
         </w:tc>
@@ -3404,7 +3572,7 @@
                 <w:sz w:val="19"/>
                 <w:szCs w:val="19"/>
               </w:rPr>
-              <w:t xml:space="preserve">Sales Support Staff</w:t>
+              <w:t xml:space="preserve">Helpers</w:t>
             </w:r>
           </w:p>
         </w:tc>
@@ -3462,7 +3630,7 @@
                 <w:sz w:val="19"/>
                 <w:szCs w:val="19"/>
               </w:rPr>
-              <w:t xml:space="preserve">Merchandising, stock handling and queue management</w:t>
+              <w:t xml:space="preserve">Housekeeping, stock handling and refill runs</w:t>
             </w:r>
           </w:p>
         </w:tc>
@@ -3493,7 +3661,7 @@
                 <w:sz w:val="19"/>
                 <w:szCs w:val="19"/>
               </w:rPr>
-              <w:t xml:space="preserve">Helper</w:t>
+              <w:t xml:space="preserve">Supervisor</w:t>
             </w:r>
           </w:p>
         </w:tc>
@@ -3551,7 +3719,7 @@
                 <w:sz w:val="19"/>
                 <w:szCs w:val="19"/>
               </w:rPr>
-              <w:t xml:space="preserve">Housekeeping and material handling</w:t>
+              <w:t xml:space="preserve">Runs the kiosk day to day; a permanent ProMarcom employee</w:t>
             </w:r>
           </w:p>
         </w:tc>
@@ -3582,7 +3750,7 @@
                 <w:sz w:val="19"/>
                 <w:szCs w:val="19"/>
               </w:rPr>
-              <w:t xml:space="preserve">Cashier</w:t>
+              <w:t xml:space="preserve">City Manager</w:t>
             </w:r>
           </w:p>
         </w:tc>
@@ -3611,7 +3779,7 @@
                 <w:sz w:val="19"/>
                 <w:szCs w:val="19"/>
               </w:rPr>
-              <w:t xml:space="preserve">1</w:t>
+              <w:t xml:space="preserve">1 per city</w:t>
             </w:r>
           </w:p>
         </w:tc>
@@ -3640,7 +3808,7 @@
                 <w:sz w:val="19"/>
                 <w:szCs w:val="19"/>
               </w:rPr>
-              <w:t xml:space="preserve">Experienced on POS/EDC machines</w:t>
+              <w:t xml:space="preserve">Deployed where a city runs more than two kiosks at the same time</w:t>
             </w:r>
           </w:p>
         </w:tc>
@@ -3649,184 +3817,6 @@
         <w:tc>
           <w:tcPr>
             <w:tcW w:type="dxa" w:w="3000"/>
-            <w:shd w:fill="F3EEE6" w:color="auto" w:val="clear"/>
-            <w:tcMar>
-              <w:top w:type="dxa" w:w="70"/>
-              <w:left w:type="dxa" w:w="110"/>
-              <w:bottom w:type="dxa" w:w="70"/>
-              <w:right w:type="dxa" w:w="110"/>
-            </w:tcMar>
-            <w:vAlign w:val="center"/>
-          </w:tcPr>
-          <w:p>
-            <w:pPr>
-              <w:spacing w:after="0"/>
-            </w:pPr>
-            <w:r>
-              <w:rPr>
-                <w:rFonts w:ascii="Calibri" w:cs="Calibri" w:eastAsia="Calibri" w:hAnsi="Calibri"/>
-                <w:b/>
-                <w:bCs/>
-                <w:color w:val="2E2A28"/>
-                <w:sz w:val="19"/>
-                <w:szCs w:val="19"/>
-              </w:rPr>
-              <w:t xml:space="preserve">Driver</w:t>
-            </w:r>
-          </w:p>
-        </w:tc>
-        <w:tc>
-          <w:tcPr>
-            <w:tcW w:type="dxa" w:w="1500"/>
-            <w:shd w:fill="F3EEE6" w:color="auto" w:val="clear"/>
-            <w:tcMar>
-              <w:top w:type="dxa" w:w="70"/>
-              <w:left w:type="dxa" w:w="110"/>
-              <w:bottom w:type="dxa" w:w="70"/>
-              <w:right w:type="dxa" w:w="110"/>
-            </w:tcMar>
-            <w:vAlign w:val="center"/>
-          </w:tcPr>
-          <w:p>
-            <w:pPr>
-              <w:spacing w:after="0"/>
-            </w:pPr>
-            <w:r>
-              <w:rPr>
-                <w:rFonts w:ascii="Calibri" w:cs="Calibri" w:eastAsia="Calibri" w:hAnsi="Calibri"/>
-                <w:b w:val="false"/>
-                <w:bCs w:val="false"/>
-                <w:color w:val="2E2A28"/>
-                <w:sz w:val="19"/>
-                <w:szCs w:val="19"/>
-              </w:rPr>
-              <w:t xml:space="preserve">1</w:t>
-            </w:r>
-          </w:p>
-        </w:tc>
-        <w:tc>
-          <w:tcPr>
-            <w:tcW w:type="dxa" w:w="4520"/>
-            <w:shd w:fill="F3EEE6" w:color="auto" w:val="clear"/>
-            <w:tcMar>
-              <w:top w:type="dxa" w:w="70"/>
-              <w:left w:type="dxa" w:w="110"/>
-              <w:bottom w:type="dxa" w:w="70"/>
-              <w:right w:type="dxa" w:w="110"/>
-            </w:tcMar>
-            <w:vAlign w:val="center"/>
-          </w:tcPr>
-          <w:p>
-            <w:pPr>
-              <w:spacing w:after="0"/>
-            </w:pPr>
-            <w:r>
-              <w:rPr>
-                <w:rFonts w:ascii="Calibri" w:cs="Calibri" w:eastAsia="Calibri" w:hAnsi="Calibri"/>
-                <w:b w:val="false"/>
-                <w:bCs w:val="false"/>
-                <w:color w:val="2E2A28"/>
-                <w:sz w:val="19"/>
-                <w:szCs w:val="19"/>
-              </w:rPr>
-              <w:t xml:space="preserve">Stock transport and replenishment runs</w:t>
-            </w:r>
-          </w:p>
-        </w:tc>
-      </w:tr>
-      <w:tr>
-        <w:tc>
-          <w:tcPr>
-            <w:tcW w:type="dxa" w:w="3000"/>
-            <w:shd w:fill="FFFFFF" w:color="auto" w:val="clear"/>
-            <w:tcMar>
-              <w:top w:type="dxa" w:w="70"/>
-              <w:left w:type="dxa" w:w="110"/>
-              <w:bottom w:type="dxa" w:w="70"/>
-              <w:right w:type="dxa" w:w="110"/>
-            </w:tcMar>
-            <w:vAlign w:val="center"/>
-          </w:tcPr>
-          <w:p>
-            <w:pPr>
-              <w:spacing w:after="0"/>
-            </w:pPr>
-            <w:r>
-              <w:rPr>
-                <w:rFonts w:ascii="Calibri" w:cs="Calibri" w:eastAsia="Calibri" w:hAnsi="Calibri"/>
-                <w:b/>
-                <w:bCs/>
-                <w:color w:val="2E2A28"/>
-                <w:sz w:val="19"/>
-                <w:szCs w:val="19"/>
-              </w:rPr>
-              <w:t xml:space="preserve">Team Leader / Manager</w:t>
-            </w:r>
-          </w:p>
-        </w:tc>
-        <w:tc>
-          <w:tcPr>
-            <w:tcW w:type="dxa" w:w="1500"/>
-            <w:shd w:fill="FFFFFF" w:color="auto" w:val="clear"/>
-            <w:tcMar>
-              <w:top w:type="dxa" w:w="70"/>
-              <w:left w:type="dxa" w:w="110"/>
-              <w:bottom w:type="dxa" w:w="70"/>
-              <w:right w:type="dxa" w:w="110"/>
-            </w:tcMar>
-            <w:vAlign w:val="center"/>
-          </w:tcPr>
-          <w:p>
-            <w:pPr>
-              <w:spacing w:after="0"/>
-            </w:pPr>
-            <w:r>
-              <w:rPr>
-                <w:rFonts w:ascii="Calibri" w:cs="Calibri" w:eastAsia="Calibri" w:hAnsi="Calibri"/>
-                <w:b w:val="false"/>
-                <w:bCs w:val="false"/>
-                <w:color w:val="2E2A28"/>
-                <w:sz w:val="19"/>
-                <w:szCs w:val="19"/>
-              </w:rPr>
-              <w:t xml:space="preserve">1</w:t>
-            </w:r>
-          </w:p>
-        </w:tc>
-        <w:tc>
-          <w:tcPr>
-            <w:tcW w:type="dxa" w:w="4520"/>
-            <w:shd w:fill="FFFFFF" w:color="auto" w:val="clear"/>
-            <w:tcMar>
-              <w:top w:type="dxa" w:w="70"/>
-              <w:left w:type="dxa" w:w="110"/>
-              <w:bottom w:type="dxa" w:w="70"/>
-              <w:right w:type="dxa" w:w="110"/>
-            </w:tcMar>
-            <w:vAlign w:val="center"/>
-          </w:tcPr>
-          <w:p>
-            <w:pPr>
-              <w:spacing w:after="0"/>
-            </w:pPr>
-            <w:r>
-              <w:rPr>
-                <w:rFonts w:ascii="Calibri" w:cs="Calibri" w:eastAsia="Calibri" w:hAnsi="Calibri"/>
-                <w:b w:val="false"/>
-                <w:bCs w:val="false"/>
-                <w:color w:val="2E2A28"/>
-                <w:sz w:val="19"/>
-                <w:szCs w:val="19"/>
-              </w:rPr>
-              <w:t xml:space="preserve">Permanent ProMarcom employee who runs the kiosk</w:t>
-            </w:r>
-          </w:p>
-        </w:tc>
-      </w:tr>
-      <w:tr>
-        <w:tc>
-          <w:tcPr>
-            <w:tcW w:type="dxa" w:w="3000"/>
             <w:shd w:fill="EADFCE" w:color="auto" w:val="clear"/>
             <w:tcMar>
               <w:top w:type="dxa" w:w="70"/>
@@ -3849,7 +3839,7 @@
                 <w:sz w:val="19"/>
                 <w:szCs w:val="19"/>
               </w:rPr>
-              <w:t xml:space="preserve">Total per kiosk</w:t>
+              <w:t xml:space="preserve">Core team per kiosk</w:t>
             </w:r>
           </w:p>
         </w:tc>
@@ -3878,7 +3868,7 @@
                 <w:sz w:val="19"/>
                 <w:szCs w:val="19"/>
               </w:rPr>
-              <w:t xml:space="preserve">12</w:t>
+              <w:t xml:space="preserve">8</w:t>
             </w:r>
           </w:p>
         </w:tc>
@@ -3907,7 +3897,7 @@
                 <w:sz w:val="19"/>
                 <w:szCs w:val="19"/>
               </w:rPr>
-              <w:t xml:space="preserve">Plus a trained bench of about 15% per city for quick cover</w:t>
+              <w:t xml:space="preserve">Plus a City Manager where needed and a ~15% trained bench per city</w:t>
             </w:r>
           </w:p>
         </w:tc>
@@ -3943,7 +3933,7 @@
           <w:sz w:val="21"/>
           <w:szCs w:val="21"/>
         </w:rPr>
-        <w:t xml:space="preserve">The plan below is shown relative to go-live (T), with a six-week trading window. All locations launch together in the same window, so the same plan applies to every city in parallel. Exact calendar dates are fixed once malls are confirmed.</w:t>
+        <w:t xml:space="preserve">The plan below is shown relative to go-live (T), with a six-week trading window. All locations launch together in the same window, so the same plan applies to every city in parallel. A few cities may extend beyond the six weeks to cover Christmas and New Year, with dismantling shifted accordingly. Exact calendar dates are fixed once malls are confirmed.</w:t>
       </w:r>
     </w:p>
     <w:tbl>
@@ -4692,7 +4682,7 @@
                 <w:sz w:val="19"/>
                 <w:szCs w:val="19"/>
               </w:rPr>
-              <w:t xml:space="preserve">Dismantle, fixture and unsold-stock return</w:t>
+              <w:t xml:space="preserve">Extended trading in select cities (Christmas and New Year)</w:t>
             </w:r>
           </w:p>
         </w:tc>
@@ -4721,7 +4711,7 @@
                 <w:sz w:val="19"/>
                 <w:szCs w:val="19"/>
               </w:rPr>
-              <w:t xml:space="preserve">T plus 6 to 7 weeks</w:t>
+              <w:t xml:space="preserve">T plus 6 weeks onward</w:t>
             </w:r>
           </w:p>
         </w:tc>
@@ -4781,6 +4771,95 @@
                 <w:sz w:val="19"/>
                 <w:szCs w:val="19"/>
               </w:rPr>
+              <w:t xml:space="preserve">Dismantle, fixture and unsold-stock return</w:t>
+            </w:r>
+          </w:p>
+        </w:tc>
+        <w:tc>
+          <w:tcPr>
+            <w:tcW w:type="dxa" w:w="2600"/>
+            <w:shd w:fill="F3EEE6" w:color="auto" w:val="clear"/>
+            <w:tcMar>
+              <w:top w:type="dxa" w:w="70"/>
+              <w:left w:type="dxa" w:w="110"/>
+              <w:bottom w:type="dxa" w:w="70"/>
+              <w:right w:type="dxa" w:w="110"/>
+            </w:tcMar>
+            <w:vAlign w:val="center"/>
+          </w:tcPr>
+          <w:p>
+            <w:pPr>
+              <w:spacing w:after="0"/>
+            </w:pPr>
+            <w:r>
+              <w:rPr>
+                <w:rFonts w:ascii="Calibri" w:cs="Calibri" w:eastAsia="Calibri" w:hAnsi="Calibri"/>
+                <w:b w:val="false"/>
+                <w:bCs w:val="false"/>
+                <w:color w:val="2E2A28"/>
+                <w:sz w:val="19"/>
+                <w:szCs w:val="19"/>
+              </w:rPr>
+              <w:t xml:space="preserve">T plus 6 to 7 weeks</w:t>
+            </w:r>
+          </w:p>
+        </w:tc>
+        <w:tc>
+          <w:tcPr>
+            <w:tcW w:type="dxa" w:w="1820"/>
+            <w:shd w:fill="F3EEE6" w:color="auto" w:val="clear"/>
+            <w:tcMar>
+              <w:top w:type="dxa" w:w="70"/>
+              <w:left w:type="dxa" w:w="110"/>
+              <w:bottom w:type="dxa" w:w="70"/>
+              <w:right w:type="dxa" w:w="110"/>
+            </w:tcMar>
+            <w:vAlign w:val="center"/>
+          </w:tcPr>
+          <w:p>
+            <w:pPr>
+              <w:spacing w:after="0"/>
+            </w:pPr>
+            <w:r>
+              <w:rPr>
+                <w:rFonts w:ascii="Calibri" w:cs="Calibri" w:eastAsia="Calibri" w:hAnsi="Calibri"/>
+                <w:b w:val="false"/>
+                <w:bCs w:val="false"/>
+                <w:color w:val="2E2A28"/>
+                <w:sz w:val="19"/>
+                <w:szCs w:val="19"/>
+              </w:rPr>
+              <w:t xml:space="preserve">ProMarcom</w:t>
+            </w:r>
+          </w:p>
+        </w:tc>
+      </w:tr>
+      <w:tr>
+        <w:tc>
+          <w:tcPr>
+            <w:tcW w:type="dxa" w:w="4600"/>
+            <w:shd w:fill="FFFFFF" w:color="auto" w:val="clear"/>
+            <w:tcMar>
+              <w:top w:type="dxa" w:w="70"/>
+              <w:left w:type="dxa" w:w="110"/>
+              <w:bottom w:type="dxa" w:w="70"/>
+              <w:right w:type="dxa" w:w="110"/>
+            </w:tcMar>
+            <w:vAlign w:val="center"/>
+          </w:tcPr>
+          <w:p>
+            <w:pPr>
+              <w:spacing w:after="0"/>
+            </w:pPr>
+            <w:r>
+              <w:rPr>
+                <w:rFonts w:ascii="Calibri" w:cs="Calibri" w:eastAsia="Calibri" w:hAnsi="Calibri"/>
+                <w:b/>
+                <w:bCs/>
+                <w:color w:val="2E2A28"/>
+                <w:sz w:val="19"/>
+                <w:szCs w:val="19"/>
+              </w:rPr>
               <w:t xml:space="preserve">Final reconciliation and season review</w:t>
             </w:r>
           </w:p>
@@ -4788,7 +4867,7 @@
         <w:tc>
           <w:tcPr>
             <w:tcW w:type="dxa" w:w="2600"/>
-            <w:shd w:fill="F3EEE6" w:color="auto" w:val="clear"/>
+            <w:shd w:fill="FFFFFF" w:color="auto" w:val="clear"/>
             <w:tcMar>
               <w:top w:type="dxa" w:w="70"/>
               <w:left w:type="dxa" w:w="110"/>
@@ -4817,7 +4896,7 @@
         <w:tc>
           <w:tcPr>
             <w:tcW w:type="dxa" w:w="1820"/>
-            <w:shd w:fill="F3EEE6" w:color="auto" w:val="clear"/>
+            <w:shd w:fill="FFFFFF" w:color="auto" w:val="clear"/>
             <w:tcMar>
               <w:top w:type="dxa" w:w="70"/>
               <w:left w:type="dxa" w:w="110"/>
@@ -5152,7 +5231,7 @@
           <w:sz w:val="21"/>
           <w:szCs w:val="21"/>
         </w:rPr>
-        <w:t xml:space="preserve">You supply the stock, the kiosk design and kit, the furniture (unless we agree otherwise), the POS/EDC machines and the uniforms (returnable).</w:t>
+        <w:t xml:space="preserve">You supply the stock, the furniture (unless we agree otherwise) and the uniforms (returnable). The kiosk design sits with ProMarcom, and billing hardware and software is to be discussed and agreed separately.</w:t>
       </w:r>
     </w:p>
     <w:p>

</xml_diff>

<commit_message>
Further client revisions to Understanding doc
- You supply stock and uniforms only; furniture is part of the kiosk
- Billing hardware provided by ProMarcom; software to be discussed
- Supervisor no longer described as a permanent ProMarcom employee
- Timeline/Gantt: 'will be prepared and shared' with the team
- Remove compliance sign-off commitment, insurance-in-transit line, and mall-fee pass-through line

Co-Authored-By: Claude Opus 4.8 <noreply@anthropic.com>
Claude-Session: https://claude.ai/code/session_01SPjFYHW1nTDVr5tUuToRXR
</commit_message>
<xml_diff>
--- a/doft_diwali_popup/Doft_Understanding_and_Key_Deliverables.docx
+++ b/doft_diwali_popup/Doft_Understanding_and_Key_Deliverables.docx
@@ -154,7 +154,7 @@
           <w:sz w:val="21"/>
           <w:szCs w:val="21"/>
         </w:rPr>
-        <w:t xml:space="preserve">Doft runs premium home-fragrance kiosks in leading malls through the Diwali season. For 2026, and with the plan to carry on in 2027 and 2028, you will run compact 8x8 ft kiosks in busy malls across the metros and sub-metros, trading for six weeks around Diwali, with a few cities continuing through Christmas and New Year. We handle everything on the ground, from the kiosk design and build to hiring, deployment and the day-to-day running. You supply the stock, the furniture and the uniforms. Billing hardware and software is still to be discussed.</w:t>
+        <w:t xml:space="preserve">Doft runs premium home-fragrance kiosks in leading malls through the Diwali season. For 2026, and with the plan to carry on in 2027 and 2028, you will run compact 8x8 ft kiosks in busy malls across the metros and sub-metros, trading for six weeks around Diwali, with a few cities continuing through Christmas and New Year. We handle everything on the ground, from the kiosk design and build to hiring, deployment and the day-to-day running. You supply the stock and the uniforms; the furniture is part of the kiosk we build. We provide the billing hardware, and the software is still to be discussed.</w:t>
       </w:r>
     </w:p>
     <w:p>
@@ -778,7 +778,7 @@
                 <w:sz w:val="19"/>
                 <w:szCs w:val="19"/>
               </w:rPr>
-              <w:t xml:space="preserve">To be discussed and agreed</w:t>
+              <w:t xml:space="preserve">Billing hardware provided by ProMarcom; software to be discussed</w:t>
             </w:r>
           </w:p>
         </w:tc>
@@ -838,7 +838,7 @@
                 <w:sz w:val="19"/>
                 <w:szCs w:val="19"/>
               </w:rPr>
-              <w:t xml:space="preserve">Stock, furniture and uniforms (returnable)</w:t>
+              <w:t xml:space="preserve">Stock and uniforms (returnable); furniture is part of the kiosk</w:t>
             </w:r>
           </w:p>
         </w:tc>
@@ -3719,7 +3719,7 @@
                 <w:sz w:val="19"/>
                 <w:szCs w:val="19"/>
               </w:rPr>
-              <w:t xml:space="preserve">Runs the kiosk day to day; a permanent ProMarcom employee</w:t>
+              <w:t xml:space="preserve">Runs the kiosk day to day</w:t>
             </w:r>
           </w:p>
         </w:tc>
@@ -4937,7 +4937,7 @@
           <w:sz w:val="19"/>
           <w:szCs w:val="19"/>
         </w:rPr>
-        <w:t xml:space="preserve">A live project timeline and per-city Gantt are maintained in the operations workbook and shared with your team.</w:t>
+        <w:t xml:space="preserve">A project timeline and per-city Gantt will be prepared and shared with your team.</w:t>
       </w:r>
     </w:p>
     <w:p>
@@ -5174,25 +5174,6 @@
           <w:sz w:val="21"/>
           <w:szCs w:val="21"/>
         </w:rPr>
-        <w:t xml:space="preserve">Compliance signed off before every go-live: licences, GST and e-invoicing, PF and ESIC, insurance, fire and electrical, and staff background checks.</w:t>
-      </w:r>
-    </w:p>
-    <w:p>
-      <w:pPr>
-        <w:pStyle w:val="ListParagraph"/>
-        <w:numPr>
-          <w:ilvl w:val="0"/>
-          <w:numId w:val="2"/>
-        </w:numPr>
-        <w:spacing w:after="60"/>
-      </w:pPr>
-      <w:r>
-        <w:rPr>
-          <w:rFonts w:ascii="Calibri" w:cs="Calibri" w:eastAsia="Calibri" w:hAnsi="Calibri"/>
-          <w:color w:val="2E2A28"/>
-          <w:sz w:val="21"/>
-          <w:szCs w:val="21"/>
-        </w:rPr>
         <w:t xml:space="preserve">The same service quality and brand standards across every city, even when several run at once.</w:t>
       </w:r>
     </w:p>
@@ -5231,7 +5212,7 @@
           <w:sz w:val="21"/>
           <w:szCs w:val="21"/>
         </w:rPr>
-        <w:t xml:space="preserve">You supply the stock, the furniture (unless we agree otherwise) and the uniforms (returnable). The kiosk design sits with ProMarcom, and billing hardware and software is to be discussed and agreed separately.</w:t>
+        <w:t xml:space="preserve">You supply the stock and the uniforms (returnable). The furniture is part of the kiosk, and the kiosk design sits with ProMarcom. We provide the billing hardware; the software is to be discussed.</w:t>
       </w:r>
     </w:p>
     <w:p>
@@ -5250,26 +5231,7 @@
           <w:sz w:val="21"/>
           <w:szCs w:val="21"/>
         </w:rPr>
-        <w:t xml:space="preserve">Stock is picked up from your Ghaziabad warehouse. We take care of insurance in transit and safe handling.</w:t>
-      </w:r>
-    </w:p>
-    <w:p>
-      <w:pPr>
-        <w:pStyle w:val="ListParagraph"/>
-        <w:numPr>
-          <w:ilvl w:val="0"/>
-          <w:numId w:val="2"/>
-        </w:numPr>
-        <w:spacing w:after="60"/>
-      </w:pPr>
-      <w:r>
-        <w:rPr>
-          <w:rFonts w:ascii="Calibri" w:cs="Calibri" w:eastAsia="Calibri" w:hAnsi="Calibri"/>
-          <w:color w:val="2E2A28"/>
-          <w:sz w:val="21"/>
-          <w:szCs w:val="21"/>
-        </w:rPr>
-        <w:t xml:space="preserve">If we pay any mall licence or space fees, we will bill them as a pass-through unless we agree otherwise. We will confirm this mall by mall.</w:t>
+        <w:t xml:space="preserve">Stock is picked up from your Ghaziabad warehouse.</w:t>
       </w:r>
     </w:p>
     <w:p>

</xml_diff>